<commit_message>
Add Mitigation: in non-compete static mitigation
</commit_message>
<xml_diff>
--- a/docs/non_compete_nda_kb.docx
+++ b/docs/non_compete_nda_kb.docx
@@ -267,23 +267,7 @@
         </w:numPr>
       </w:pPr>
       <w:r>
-        <w:t xml:space="preserve">Static Mitigation: If </w:t>
-      </w:r>
-      <w:proofErr w:type="spellStart"/>
-      <w:r>
-        <w:t>risk_triggered</w:t>
-      </w:r>
-      <w:proofErr w:type="spellEnd"/>
-      <w:r>
-        <w:t xml:space="preserve"> = true, </w:t>
-      </w:r>
-      <w:proofErr w:type="spellStart"/>
-      <w:r>
-        <w:t>mitigating_language</w:t>
-      </w:r>
-      <w:proofErr w:type="spellEnd"/>
-      <w:r>
-        <w:t xml:space="preserve"> MUST always be exactly:</w:t>
+        <w:t>Static Mitigation: If risk_triggered = true, mitigating_language MUST always be exactly:</w:t>
       </w:r>
       <w:r>
         <w:t xml:space="preserve"> </w:t>
@@ -301,23 +285,7 @@
         </w:numPr>
       </w:pPr>
       <w:r>
-        <w:t xml:space="preserve">If </w:t>
-      </w:r>
-      <w:proofErr w:type="spellStart"/>
-      <w:r>
-        <w:t>risk_triggered</w:t>
-      </w:r>
-      <w:proofErr w:type="spellEnd"/>
-      <w:r>
-        <w:t xml:space="preserve"> = false, </w:t>
-      </w:r>
-      <w:proofErr w:type="spellStart"/>
-      <w:r>
-        <w:t>mitigating_language</w:t>
-      </w:r>
-      <w:proofErr w:type="spellEnd"/>
-      <w:r>
-        <w:t xml:space="preserve"> MUST be null.</w:t>
+        <w:t>If risk_triggered = false, mitigating_language MUST be null.</w:t>
       </w:r>
     </w:p>
     <w:p>
@@ -328,13 +296,8 @@
           <w:numId w:val="12"/>
         </w:numPr>
       </w:pPr>
-      <w:proofErr w:type="spellStart"/>
-      <w:r>
-        <w:t>mitigating_language</w:t>
-      </w:r>
-      <w:proofErr w:type="spellEnd"/>
-      <w:r>
-        <w:t xml:space="preserve"> MUST NOT include [DEL] markers.</w:t>
+      <w:r>
+        <w:t>mitigating_language MUST NOT include [DEL] markers.</w:t>
       </w:r>
     </w:p>
     <w:p>
@@ -345,13 +308,8 @@
           <w:numId w:val="12"/>
         </w:numPr>
       </w:pPr>
-      <w:proofErr w:type="spellStart"/>
-      <w:r>
-        <w:t>mitigating_language</w:t>
-      </w:r>
-      <w:proofErr w:type="spellEnd"/>
-      <w:r>
-        <w:t xml:space="preserve"> MUST NOT include the original NDA clause.</w:t>
+      <w:r>
+        <w:t>mitigating_language MUST NOT include the original NDA clause.</w:t>
       </w:r>
     </w:p>
     <w:p>
@@ -362,14 +320,9 @@
           <w:numId w:val="12"/>
         </w:numPr>
       </w:pPr>
-      <w:proofErr w:type="spellStart"/>
       <w:r>
         <w:lastRenderedPageBreak/>
-        <w:t>mitigating_language</w:t>
-      </w:r>
-      <w:proofErr w:type="spellEnd"/>
-      <w:r>
-        <w:t xml:space="preserve"> MUST NOT be replaced with "Mandatory legal review required. No auto-mitigation permitted."</w:t>
+        <w:t>mitigating_language MUST NOT be replaced with "Mandatory legal review required. No auto-mitigation permitted."</w:t>
       </w:r>
     </w:p>
     <w:p>
@@ -381,15 +334,7 @@
         </w:numPr>
       </w:pPr>
       <w:r>
-        <w:t xml:space="preserve">Deletion markers, if used, must appear only in </w:t>
-      </w:r>
-      <w:proofErr w:type="spellStart"/>
-      <w:r>
-        <w:t>clean_nda_fragment</w:t>
-      </w:r>
-      <w:proofErr w:type="spellEnd"/>
-      <w:r>
-        <w:t xml:space="preserve"> or deletion output, not in mitigating_language.</w:t>
+        <w:t>Deletion markers, if used, must appear only in clean_nda_fragment or deletion output, not in mitigating_language.</w:t>
       </w:r>
       <w:r>
         <w:t>4. Detection Guidance – Clause</w:t>
@@ -687,33 +632,18 @@
             <w:vAlign w:val="center"/>
           </w:tcPr>
           <w:p>
-            <w:proofErr w:type="spellStart"/>
             <w:r>
-              <w:t>risk_triggered</w:t>
-            </w:r>
-            <w:proofErr w:type="spellEnd"/>
-            <w:r>
-              <w:t xml:space="preserve"> = true;</w:t>
+              <w:t>risk_triggered = true;</w:t>
             </w:r>
           </w:p>
           <w:p>
-            <w:proofErr w:type="spellStart"/>
             <w:r>
-              <w:t>escalation_only</w:t>
-            </w:r>
-            <w:proofErr w:type="spellEnd"/>
-            <w:r>
-              <w:t xml:space="preserve"> = false;</w:t>
+              <w:t>escalation_only = false;</w:t>
             </w:r>
           </w:p>
           <w:p>
-            <w:proofErr w:type="spellStart"/>
             <w:r>
-              <w:t>mitigating_language</w:t>
-            </w:r>
-            <w:proofErr w:type="spellEnd"/>
-            <w:r>
-              <w:t xml:space="preserve"> = static mitigation language;</w:t>
+              <w:t>mitigating_language = static mitigation language;</w:t>
             </w:r>
           </w:p>
           <w:p>
@@ -723,13 +653,8 @@
                 <w:bCs/>
               </w:rPr>
             </w:pPr>
-            <w:proofErr w:type="spellStart"/>
             <w:r>
-              <w:t>clean_nda_fragment</w:t>
-            </w:r>
-            <w:proofErr w:type="spellEnd"/>
-            <w:r>
-              <w:t xml:space="preserve"> = clause with [DEL] markers</w:t>
+              <w:t>clean_nda_fragment = clause with [DEL] markers</w:t>
             </w:r>
           </w:p>
         </w:tc>
@@ -779,34 +704,19 @@
             <w:vAlign w:val="center"/>
           </w:tcPr>
           <w:p>
-            <w:proofErr w:type="spellStart"/>
             <w:r>
-              <w:t>risk_triggered</w:t>
-            </w:r>
-            <w:proofErr w:type="spellEnd"/>
-            <w:r>
-              <w:t xml:space="preserve"> = true;</w:t>
+              <w:t>risk_triggered = true;</w:t>
             </w:r>
           </w:p>
           <w:p>
-            <w:proofErr w:type="spellStart"/>
             <w:r>
-              <w:t>escalation_only</w:t>
-            </w:r>
-            <w:proofErr w:type="spellEnd"/>
-            <w:r>
-              <w:t xml:space="preserve"> = true;</w:t>
+              <w:t>escalation_only = true;</w:t>
             </w:r>
           </w:p>
           <w:p>
-            <w:proofErr w:type="spellStart"/>
             <w:r>
               <w:lastRenderedPageBreak/>
-              <w:t>mitigating_language</w:t>
-            </w:r>
-            <w:proofErr w:type="spellEnd"/>
-            <w:r>
-              <w:t xml:space="preserve"> = static mitigation language;</w:t>
+              <w:t>mitigating_language = static mitigation language;</w:t>
             </w:r>
           </w:p>
           <w:p>
@@ -816,13 +726,8 @@
                 <w:bCs/>
               </w:rPr>
             </w:pPr>
-            <w:proofErr w:type="spellStart"/>
             <w:r>
-              <w:t>clean_nda_fragment</w:t>
-            </w:r>
-            <w:proofErr w:type="spellEnd"/>
-            <w:r>
-              <w:t xml:space="preserve"> = null</w:t>
+              <w:t>clean_nda_fragment = null</w:t>
             </w:r>
           </w:p>
         </w:tc>
@@ -889,13 +794,8 @@
             <w:vAlign w:val="center"/>
           </w:tcPr>
           <w:p>
-            <w:proofErr w:type="spellStart"/>
             <w:r>
-              <w:t>risk_triggered</w:t>
-            </w:r>
-            <w:proofErr w:type="spellEnd"/>
-            <w:r>
-              <w:t xml:space="preserve"> = false;</w:t>
+              <w:t>risk_triggered = false;</w:t>
             </w:r>
           </w:p>
           <w:p>
@@ -949,15 +849,7 @@
       </w:r>
       <w:r>
         <w:noBreakHyphen/>
-        <w:t>Compete Risk is triggered, the risk description shown on screen must use the following text (stored in KB/</w:t>
-      </w:r>
-      <w:proofErr w:type="spellStart"/>
-      <w:r>
-        <w:t>rules_text</w:t>
-      </w:r>
-      <w:proofErr w:type="spellEnd"/>
-      <w:r>
-        <w:t>):</w:t>
+        <w:t>Compete Risk is triggered, the risk description shown on screen must use the following text (stored in KB/rules_text):</w:t>
       </w:r>
     </w:p>
     <w:p>
@@ -977,31 +869,7 @@
         </w:numPr>
       </w:pPr>
       <w:r>
-        <w:t xml:space="preserve">If </w:t>
-      </w:r>
-      <w:proofErr w:type="spellStart"/>
-      <w:r>
-        <w:t>risk_triggered</w:t>
-      </w:r>
-      <w:proofErr w:type="spellEnd"/>
-      <w:r>
-        <w:t xml:space="preserve"> = true: populate </w:t>
-      </w:r>
-      <w:proofErr w:type="spellStart"/>
-      <w:r>
-        <w:t>risk_description</w:t>
-      </w:r>
-      <w:proofErr w:type="spellEnd"/>
-      <w:r>
-        <w:t xml:space="preserve"> using the static text from </w:t>
-      </w:r>
-      <w:proofErr w:type="spellStart"/>
-      <w:r>
-        <w:t>rules_text</w:t>
-      </w:r>
-      <w:proofErr w:type="spellEnd"/>
-      <w:r>
-        <w:t>.</w:t>
+        <w:t>If risk_triggered = true: populate risk_description using the static text from rules_text.</w:t>
       </w:r>
     </w:p>
     <w:p>
@@ -1012,15 +880,7 @@
         </w:numPr>
       </w:pPr>
       <w:r>
-        <w:t xml:space="preserve">If API fails: retrieve </w:t>
-      </w:r>
-      <w:proofErr w:type="spellStart"/>
-      <w:r>
-        <w:t>risk_description</w:t>
-      </w:r>
-      <w:proofErr w:type="spellEnd"/>
-      <w:r>
-        <w:t xml:space="preserve"> from fallback KB.</w:t>
+        <w:t>If API fails: retrieve risk_description from fallback KB.</w:t>
       </w:r>
     </w:p>
     <w:p>
@@ -1031,23 +891,7 @@
         </w:numPr>
       </w:pPr>
       <w:r>
-        <w:t xml:space="preserve">If </w:t>
-      </w:r>
-      <w:proofErr w:type="spellStart"/>
-      <w:r>
-        <w:t>risk_triggered</w:t>
-      </w:r>
-      <w:proofErr w:type="spellEnd"/>
-      <w:r>
-        <w:t xml:space="preserve"> = false: set </w:t>
-      </w:r>
-      <w:proofErr w:type="spellStart"/>
-      <w:r>
-        <w:t>risk_description</w:t>
-      </w:r>
-      <w:proofErr w:type="spellEnd"/>
-      <w:r>
-        <w:t xml:space="preserve"> = null.</w:t>
+        <w:t>If risk_triggered = false: set risk_description = null.</w:t>
       </w:r>
     </w:p>
     <w:p>
@@ -1058,15 +902,7 @@
         </w:numPr>
       </w:pPr>
       <w:r>
-        <w:t xml:space="preserve">The presence or absence of </w:t>
-      </w:r>
-      <w:proofErr w:type="spellStart"/>
-      <w:r>
-        <w:t>risk_description</w:t>
-      </w:r>
-      <w:proofErr w:type="spellEnd"/>
-      <w:r>
-        <w:t xml:space="preserve"> MUST NOT affect detection, escalation, or mitigation logic.</w:t>
+        <w:t>The presence or absence of risk_description MUST NOT affect detection, escalation, or mitigation logic.</w:t>
       </w:r>
     </w:p>
     <w:p>
@@ -1108,15 +944,7 @@
     </w:p>
     <w:p>
       <w:r>
-        <w:t xml:space="preserve">When </w:t>
-      </w:r>
-      <w:proofErr w:type="spellStart"/>
-      <w:r>
-        <w:t>risk_triggered</w:t>
-      </w:r>
-      <w:proofErr w:type="spellEnd"/>
-      <w:r>
-        <w:t xml:space="preserve"> = true, the agent MUST always return the following static mitigation language: </w:t>
+        <w:t xml:space="preserve">When risk_triggered = true, the agent MUST always return the following static mitigation language: </w:t>
       </w:r>
       <w:r>
         <w:br/>
@@ -1125,6 +953,9 @@
         <w:t>“</w:t>
       </w:r>
       <w:r>
+        <w:t xml:space="preserve">Mitagation: </w:t>
+      </w:r>
+      <w:r>
         <w:t>Preferred mitigation is to remove any non-compete language in the NDA. Should the Client refuse, we need to limit the scope of the non-compete to the minimum possible (e.g. limit it to specific clients, specific people and specific scope, and limit it to a short timeframe).</w:t>
       </w:r>
       <w:r>
@@ -1194,23 +1025,7 @@
       </w:pPr>
       <w:r>
         <w:lastRenderedPageBreak/>
-        <w:t xml:space="preserve">If </w:t>
-      </w:r>
-      <w:proofErr w:type="spellStart"/>
-      <w:r>
-        <w:t>risk_triggered</w:t>
-      </w:r>
-      <w:proofErr w:type="spellEnd"/>
-      <w:r>
-        <w:t xml:space="preserve"> = false, set </w:t>
-      </w:r>
-      <w:proofErr w:type="spellStart"/>
-      <w:r>
-        <w:t>mitigating_language</w:t>
-      </w:r>
-      <w:proofErr w:type="spellEnd"/>
-      <w:r>
-        <w:t xml:space="preserve"> = null.</w:t>
+        <w:t>If risk_triggered = false, set mitigating_language = null.</w:t>
       </w:r>
     </w:p>
     <w:p>
@@ -1459,84 +1274,38 @@
       </w:r>
     </w:p>
     <w:p>
-      <w:proofErr w:type="spellStart"/>
-      <w:r>
-        <w:t>risk_triggered</w:t>
-      </w:r>
-      <w:proofErr w:type="spellEnd"/>
-      <w:r>
-        <w:t>: [true/false/null]</w:t>
-      </w:r>
-    </w:p>
-    <w:p>
-      <w:proofErr w:type="spellStart"/>
-      <w:r>
-        <w:t>escalation_only</w:t>
-      </w:r>
-      <w:proofErr w:type="spellEnd"/>
-      <w:r>
-        <w:t>: [true/false/null]</w:t>
-      </w:r>
-    </w:p>
-    <w:p>
-      <w:proofErr w:type="spellStart"/>
-      <w:r>
-        <w:t>risk_name</w:t>
-      </w:r>
-      <w:proofErr w:type="spellEnd"/>
-      <w:r>
-        <w:t>: [Non-Compete/null]</w:t>
-      </w:r>
-    </w:p>
-    <w:p>
-      <w:proofErr w:type="spellStart"/>
-      <w:r>
-        <w:t>risk_level</w:t>
-      </w:r>
-      <w:proofErr w:type="spellEnd"/>
-      <w:r>
-        <w:t>: [High/null]</w:t>
-      </w:r>
-    </w:p>
-    <w:p>
-      <w:proofErr w:type="spellStart"/>
-      <w:r>
-        <w:t>risk_description</w:t>
-      </w:r>
-      <w:proofErr w:type="spellEnd"/>
-      <w:r>
-        <w:t>:</w:t>
-      </w:r>
-    </w:p>
-    <w:p>
-      <w:r>
-        <w:t xml:space="preserve">[Static risk description from </w:t>
-      </w:r>
-      <w:proofErr w:type="spellStart"/>
-      <w:r>
-        <w:t>rules_text</w:t>
-      </w:r>
-      <w:proofErr w:type="spellEnd"/>
-      <w:r>
-        <w:t xml:space="preserve"> if </w:t>
-      </w:r>
-      <w:proofErr w:type="spellStart"/>
-      <w:r>
-        <w:t>risk_triggered</w:t>
-      </w:r>
-      <w:proofErr w:type="spellEnd"/>
-      <w:r>
-        <w:t xml:space="preserve"> = true, otherwise null]</w:t>
-      </w:r>
-    </w:p>
-    <w:p>
-      <w:proofErr w:type="spellStart"/>
-      <w:r>
-        <w:t>original_language</w:t>
-      </w:r>
-      <w:proofErr w:type="spellEnd"/>
-      <w:r>
-        <w:t>:</w:t>
+      <w:r>
+        <w:t>risk_triggered: [true/false/null]</w:t>
+      </w:r>
+    </w:p>
+    <w:p>
+      <w:r>
+        <w:t>escalation_only: [true/false/null]</w:t>
+      </w:r>
+    </w:p>
+    <w:p>
+      <w:r>
+        <w:t>risk_name: [Non-Compete/null]</w:t>
+      </w:r>
+    </w:p>
+    <w:p>
+      <w:r>
+        <w:t>risk_level: [High/null]</w:t>
+      </w:r>
+    </w:p>
+    <w:p>
+      <w:r>
+        <w:t>risk_description:</w:t>
+      </w:r>
+    </w:p>
+    <w:p>
+      <w:r>
+        <w:t>[Static risk description from rules_text if risk_triggered = true, otherwise null]</w:t>
+      </w:r>
+    </w:p>
+    <w:p>
+      <w:r>
+        <w:t>original_language:</w:t>
       </w:r>
     </w:p>
     <w:p>
@@ -1545,13 +1314,8 @@
       </w:r>
     </w:p>
     <w:p>
-      <w:proofErr w:type="spellStart"/>
-      <w:r>
-        <w:t>reason_for_deletion</w:t>
-      </w:r>
-      <w:proofErr w:type="spellEnd"/>
-      <w:r>
-        <w:t>:</w:t>
+      <w:r>
+        <w:t>reason_for_deletion:</w:t>
       </w:r>
     </w:p>
     <w:p>
@@ -1560,65 +1324,23 @@
       </w:r>
     </w:p>
     <w:p>
-      <w:proofErr w:type="spellStart"/>
-      <w:r>
-        <w:t>mitigating_language</w:t>
-      </w:r>
-      <w:proofErr w:type="spellEnd"/>
-      <w:r>
-        <w:t>:</w:t>
-      </w:r>
-    </w:p>
-    <w:p>
-      <w:r>
-        <w:t xml:space="preserve">[Static mitigation language from </w:t>
-      </w:r>
-      <w:proofErr w:type="spellStart"/>
-      <w:r>
-        <w:t>rules_text</w:t>
-      </w:r>
-      <w:proofErr w:type="spellEnd"/>
-      <w:r>
-        <w:t xml:space="preserve"> if </w:t>
-      </w:r>
-      <w:proofErr w:type="spellStart"/>
-      <w:r>
-        <w:t>risk_triggered</w:t>
-      </w:r>
-      <w:proofErr w:type="spellEnd"/>
-      <w:r>
-        <w:t xml:space="preserve"> = true, otherwise null]</w:t>
-      </w:r>
-    </w:p>
-    <w:p>
-      <w:proofErr w:type="spellStart"/>
-      <w:r>
-        <w:t>clean_nda_fragment</w:t>
-      </w:r>
-      <w:proofErr w:type="spellEnd"/>
-      <w:r>
-        <w:t>:</w:t>
-      </w:r>
-    </w:p>
-    <w:p>
-      <w:r>
-        <w:t xml:space="preserve">[Exact clause wrapped in [DEL] markers if </w:t>
-      </w:r>
-      <w:proofErr w:type="spellStart"/>
-      <w:r>
-        <w:t>risk_triggered</w:t>
-      </w:r>
-      <w:proofErr w:type="spellEnd"/>
-      <w:r>
-        <w:t xml:space="preserve"> = true and </w:t>
-      </w:r>
-      <w:proofErr w:type="spellStart"/>
-      <w:r>
-        <w:t>escalation_only</w:t>
-      </w:r>
-      <w:proofErr w:type="spellEnd"/>
-      <w:r>
-        <w:t xml:space="preserve"> = false, otherwise null]</w:t>
+      <w:r>
+        <w:t>mitigating_language:</w:t>
+      </w:r>
+    </w:p>
+    <w:p>
+      <w:r>
+        <w:t>[Static mitigation language from rules_text if risk_triggered = true, otherwise null]</w:t>
+      </w:r>
+    </w:p>
+    <w:p>
+      <w:r>
+        <w:t>clean_nda_fragment:</w:t>
+      </w:r>
+    </w:p>
+    <w:p>
+      <w:r>
+        <w:t>[Exact clause wrapped in [DEL] markers if risk_triggered = true and escalation_only = false, otherwise null]</w:t>
       </w:r>
     </w:p>
     <w:p>
@@ -1643,23 +1365,7 @@
     </w:p>
     <w:p>
       <w:r>
-        <w:t xml:space="preserve">If </w:t>
-      </w:r>
-      <w:proofErr w:type="spellStart"/>
-      <w:r>
-        <w:t>risk_triggered</w:t>
-      </w:r>
-      <w:proofErr w:type="spellEnd"/>
-      <w:r>
-        <w:t xml:space="preserve"> = true, </w:t>
-      </w:r>
-      <w:proofErr w:type="spellStart"/>
-      <w:r>
-        <w:t>mitigating_language</w:t>
-      </w:r>
-      <w:proofErr w:type="spellEnd"/>
-      <w:r>
-        <w:t xml:space="preserve"> MUST always be exactly:</w:t>
+        <w:t>If risk_triggered = true, mitigating_language MUST always be exactly:</w:t>
       </w:r>
     </w:p>
     <w:p>
@@ -1669,23 +1375,7 @@
     </w:p>
     <w:p>
       <w:r>
-        <w:t xml:space="preserve">If </w:t>
-      </w:r>
-      <w:proofErr w:type="spellStart"/>
-      <w:r>
-        <w:t>risk_triggered</w:t>
-      </w:r>
-      <w:proofErr w:type="spellEnd"/>
-      <w:r>
-        <w:t xml:space="preserve"> = false, </w:t>
-      </w:r>
-      <w:proofErr w:type="spellStart"/>
-      <w:r>
-        <w:t>mitigating_language</w:t>
-      </w:r>
-      <w:proofErr w:type="spellEnd"/>
-      <w:r>
-        <w:t xml:space="preserve"> MUST be null.</w:t>
+        <w:t>If risk_triggered = false, mitigating_language MUST be null.</w:t>
       </w:r>
     </w:p>
     <w:p>
@@ -4916,27 +4606,6 @@
 </file>
 
 <file path=customXml/item1.xml><?xml version="1.0" encoding="utf-8"?>
-<p:properties xmlns:p="http://schemas.microsoft.com/office/2006/metadata/properties" xmlns:xsi="http://www.w3.org/2001/XMLSchema-instance" xmlns:pc="http://schemas.microsoft.com/office/infopath/2007/PartnerControls">
-  <documentManagement>
-    <TaxCatchAll xmlns="58fb48c5-ad38-47d1-9aa6-9b4f1dc114f9" xsi:nil="true"/>
-    <lcf76f155ced4ddcb4097134ff3c332f xmlns="aba9ad68-f961-4806-8372-ded3e8039a5f">
-      <Terms xmlns="http://schemas.microsoft.com/office/infopath/2007/PartnerControls"/>
-    </lcf76f155ced4ddcb4097134ff3c332f>
-    <Reusable xmlns="aba9ad68-f961-4806-8372-ded3e8039a5f">true</Reusable>
-  </documentManagement>
-</p:properties>
-</file>
-
-<file path=customXml/item2.xml><?xml version="1.0" encoding="utf-8"?>
-<?mso-contentType ?>
-<FormTemplates xmlns="http://schemas.microsoft.com/sharepoint/v3/contenttype/forms">
-  <Display>DocumentLibraryForm</Display>
-  <Edit>DocumentLibraryForm</Edit>
-  <New>DocumentLibraryForm</New>
-</FormTemplates>
-</file>
-
-<file path=customXml/item3.xml><?xml version="1.0" encoding="utf-8"?>
 <ct:contentTypeSchema xmlns:ct="http://schemas.microsoft.com/office/2006/metadata/contentType" xmlns:ma="http://schemas.microsoft.com/office/2006/metadata/properties/metaAttributes" ct:_="" ma:_="" ma:contentTypeName="Document" ma:contentTypeID="0x010100A5AA8A3CABF36C429B74A94C24258E55" ma:contentTypeVersion="21" ma:contentTypeDescription="Create a new document." ma:contentTypeScope="" ma:versionID="9d590b9c745b5d4d086e55351edde6c7">
   <xsd:schema xmlns:xsd="http://www.w3.org/2001/XMLSchema" xmlns:xs="http://www.w3.org/2001/XMLSchema" xmlns:p="http://schemas.microsoft.com/office/2006/metadata/properties" xmlns:ns2="aba9ad68-f961-4806-8372-ded3e8039a5f" xmlns:ns3="58fb48c5-ad38-47d1-9aa6-9b4f1dc114f9" targetNamespace="http://schemas.microsoft.com/office/2006/metadata/properties" ma:root="true" ma:fieldsID="656ed3350af39d0ad06ab4725df265a1" ns2:_="" ns3:_="">
     <xsd:import namespace="aba9ad68-f961-4806-8372-ded3e8039a5f"/>
@@ -5203,26 +4872,28 @@
 </ct:contentTypeSchema>
 </file>
 
-<file path=customXml/itemProps1.xml><?xml version="1.0" encoding="utf-8"?>
-<ds:datastoreItem xmlns:ds="http://schemas.openxmlformats.org/officeDocument/2006/customXml" ds:itemID="{98006E03-F9EB-4430-A6EE-9E2B1EAF75FC}">
-  <ds:schemaRefs>
-    <ds:schemaRef ds:uri="http://schemas.microsoft.com/office/2006/metadata/properties"/>
-    <ds:schemaRef ds:uri="http://schemas.microsoft.com/office/infopath/2007/PartnerControls"/>
-    <ds:schemaRef ds:uri="58fb48c5-ad38-47d1-9aa6-9b4f1dc114f9"/>
-    <ds:schemaRef ds:uri="aba9ad68-f961-4806-8372-ded3e8039a5f"/>
-  </ds:schemaRefs>
-</ds:datastoreItem>
+<file path=customXml/item2.xml><?xml version="1.0" encoding="utf-8"?>
+<?mso-contentType ?>
+<FormTemplates xmlns="http://schemas.microsoft.com/sharepoint/v3/contenttype/forms">
+  <Display>DocumentLibraryForm</Display>
+  <Edit>DocumentLibraryForm</Edit>
+  <New>DocumentLibraryForm</New>
+</FormTemplates>
 </file>
 
-<file path=customXml/itemProps2.xml><?xml version="1.0" encoding="utf-8"?>
-<ds:datastoreItem xmlns:ds="http://schemas.openxmlformats.org/officeDocument/2006/customXml" ds:itemID="{6898DFBC-764B-45C4-98E9-29815E587E04}">
-  <ds:schemaRefs>
-    <ds:schemaRef ds:uri="http://schemas.microsoft.com/sharepoint/v3/contenttype/forms"/>
-  </ds:schemaRefs>
-</ds:datastoreItem>
+<file path=customXml/item3.xml><?xml version="1.0" encoding="utf-8"?>
+<p:properties xmlns:p="http://schemas.microsoft.com/office/2006/metadata/properties" xmlns:xsi="http://www.w3.org/2001/XMLSchema-instance" xmlns:pc="http://schemas.microsoft.com/office/infopath/2007/PartnerControls">
+  <documentManagement>
+    <TaxCatchAll xmlns="58fb48c5-ad38-47d1-9aa6-9b4f1dc114f9" xsi:nil="true"/>
+    <lcf76f155ced4ddcb4097134ff3c332f xmlns="aba9ad68-f961-4806-8372-ded3e8039a5f">
+      <Terms xmlns="http://schemas.microsoft.com/office/infopath/2007/PartnerControls"/>
+    </lcf76f155ced4ddcb4097134ff3c332f>
+    <Reusable xmlns="aba9ad68-f961-4806-8372-ded3e8039a5f">true</Reusable>
+  </documentManagement>
+</p:properties>
 </file>
 
-<file path=customXml/itemProps3.xml><?xml version="1.0" encoding="utf-8"?>
+<file path=customXml/itemProps1.xml><?xml version="1.0" encoding="utf-8"?>
 <ds:datastoreItem xmlns:ds="http://schemas.openxmlformats.org/officeDocument/2006/customXml" ds:itemID="{D3381785-8BF5-4938-A38B-D087BAC00282}">
   <ds:schemaRefs>
     <ds:schemaRef ds:uri="http://schemas.microsoft.com/office/2006/metadata/contentType"/>
@@ -5239,4 +4910,23 @@
     <ds:schemaRef ds:uri="http://schemas.microsoft.com/internal/obd"/>
   </ds:schemaRefs>
 </ds:datastoreItem>
+</file>
+
+<file path=customXml/itemProps2.xml><?xml version="1.0" encoding="utf-8"?>
+<ds:datastoreItem xmlns:ds="http://schemas.openxmlformats.org/officeDocument/2006/customXml" ds:itemID="{6898DFBC-764B-45C4-98E9-29815E587E04}">
+  <ds:schemaRefs>
+    <ds:schemaRef ds:uri="http://schemas.microsoft.com/sharepoint/v3/contenttype/forms"/>
+  </ds:schemaRefs>
+</ds:datastoreItem>
+</file>
+
+<file path=customXml/itemProps3.xml><?xml version="1.0" encoding="utf-8"?>
+<ds:datastoreItem xmlns:ds="http://schemas.openxmlformats.org/officeDocument/2006/customXml" ds:itemID="{98006E03-F9EB-4430-A6EE-9E2B1EAF75FC}">
+  <ds:schemaRefs>
+    <ds:schemaRef ds:uri="http://schemas.microsoft.com/office/2006/metadata/properties"/>
+    <ds:schemaRef ds:uri="http://schemas.microsoft.com/office/infopath/2007/PartnerControls"/>
+    <ds:schemaRef ds:uri="58fb48c5-ad38-47d1-9aa6-9b4f1dc114f9"/>
+    <ds:schemaRef ds:uri="aba9ad68-f961-4806-8372-ded3e8039a5f"/>
+  </ds:schemaRefs>
+</ds:datastoreItem>
 </file>
</xml_diff>

<commit_message>
Adjust non compete static mitigation
</commit_message>
<xml_diff>
--- a/docs/non_compete_nda_kb.docx
+++ b/docs/non_compete_nda_kb.docx
@@ -4,6 +4,7 @@
   <w:body>
     <w:p>
       <w:pPr>
+        <w:spacing w:line="278" w:lineRule="auto"/>
         <w:rPr>
           <w:b/>
           <w:bCs/>
@@ -27,6 +28,7 @@
     </w:p>
     <w:p>
       <w:pPr>
+        <w:spacing w:line="278" w:lineRule="auto"/>
         <w:rPr>
           <w:b/>
           <w:bCs/>
@@ -41,6 +43,9 @@
       </w:r>
     </w:p>
     <w:p>
+      <w:pPr>
+        <w:spacing w:line="278" w:lineRule="auto"/>
+      </w:pPr>
       <w:r>
         <w:t>This KB governs detection, validation, and remediation of Non</w:t>
       </w:r>
@@ -55,6 +60,7 @@
     </w:p>
     <w:p>
       <w:pPr>
+        <w:spacing w:line="278" w:lineRule="auto"/>
         <w:rPr>
           <w:b/>
           <w:bCs/>
@@ -74,6 +80,7 @@
           <w:ilvl w:val="0"/>
           <w:numId w:val="1"/>
         </w:numPr>
+        <w:spacing w:line="278" w:lineRule="auto"/>
       </w:pPr>
       <w:r>
         <w:rPr>
@@ -96,6 +103,7 @@
           <w:ilvl w:val="0"/>
           <w:numId w:val="1"/>
         </w:numPr>
+        <w:spacing w:line="278" w:lineRule="auto"/>
       </w:pPr>
       <w:r>
         <w:rPr>
@@ -122,6 +130,7 @@
           <w:ilvl w:val="0"/>
           <w:numId w:val="1"/>
         </w:numPr>
+        <w:spacing w:line="278" w:lineRule="auto"/>
       </w:pPr>
       <w:r>
         <w:rPr>
@@ -140,6 +149,7 @@
           <w:ilvl w:val="0"/>
           <w:numId w:val="1"/>
         </w:numPr>
+        <w:spacing w:line="278" w:lineRule="auto"/>
       </w:pPr>
       <w:r>
         <w:rPr>
@@ -154,6 +164,7 @@
     </w:p>
     <w:p>
       <w:pPr>
+        <w:spacing w:line="278" w:lineRule="auto"/>
         <w:rPr>
           <w:b/>
           <w:bCs/>
@@ -173,6 +184,7 @@
           <w:ilvl w:val="0"/>
           <w:numId w:val="2"/>
         </w:numPr>
+        <w:spacing w:line="278" w:lineRule="auto"/>
       </w:pPr>
       <w:r>
         <w:rPr>
@@ -195,6 +207,7 @@
           <w:ilvl w:val="0"/>
           <w:numId w:val="2"/>
         </w:numPr>
+        <w:spacing w:line="278" w:lineRule="auto"/>
       </w:pPr>
       <w:r>
         <w:rPr>
@@ -213,6 +226,7 @@
           <w:ilvl w:val="0"/>
           <w:numId w:val="2"/>
         </w:numPr>
+        <w:spacing w:line="278" w:lineRule="auto"/>
       </w:pPr>
       <w:r>
         <w:rPr>
@@ -231,6 +245,7 @@
           <w:ilvl w:val="0"/>
           <w:numId w:val="2"/>
         </w:numPr>
+        <w:spacing w:line="278" w:lineRule="auto"/>
       </w:pPr>
       <w:r>
         <w:rPr>
@@ -245,6 +260,7 @@
     </w:p>
     <w:p>
       <w:pPr>
+        <w:spacing w:line="278" w:lineRule="auto"/>
         <w:rPr>
           <w:b/>
           <w:bCs/>
@@ -267,138 +283,157 @@
         </w:numPr>
       </w:pPr>
       <w:r>
-        <w:t xml:space="preserve">Static Mitigation: If </w:t>
-      </w:r>
-      <w:proofErr w:type="spellStart"/>
-      <w:r>
-        <w:t>risk_triggered</w:t>
-      </w:r>
-      <w:proofErr w:type="spellEnd"/>
-      <w:r>
-        <w:t xml:space="preserve"> = true, </w:t>
-      </w:r>
-      <w:proofErr w:type="spellStart"/>
-      <w:r>
-        <w:t>mitigating_language</w:t>
-      </w:r>
-      <w:proofErr w:type="spellEnd"/>
-      <w:r>
-        <w:t xml:space="preserve"> MUST always be exactly:</w:t>
-      </w:r>
-      <w:r>
-        <w:t xml:space="preserve"> </w:t>
-      </w:r>
-      <w:r>
-        <w:t>"</w:t>
-      </w:r>
-      <w:r>
-        <w:t xml:space="preserve">Mitigation: </w:t>
-      </w:r>
-      <w:r>
-        <w:t>Preferred mitigation is to remove any non-compete language in the NDA. Should the Client refuse, we need to limit the scope of the non-compete to the minimum possible (e.g. limit it to specific clients, specific people and specific scope, and limit it to a short timeframe)."</w:t>
-      </w:r>
-    </w:p>
-    <w:p>
-      <w:pPr>
-        <w:pStyle w:val="ListParagraph"/>
+        <w:rPr>
+          <w:b/>
+        </w:rPr>
+        <w:t>Static Mitigation</w:t>
+      </w:r>
+      <w:r>
+        <w:br/>
+      </w:r>
+      <w:r>
+        <w:br/>
+        <w:t>When Non-Compete Risk is triggered</w:t>
+      </w:r>
+      <w:r>
+        <w:t>, mitigating_language</w:t>
+      </w:r>
+      <w:r>
+        <w:t xml:space="preserve"> MUST </w:t>
+      </w:r>
+      <w:r>
+        <w:t xml:space="preserve">use the following approved static text </w:t>
+      </w:r>
+      <w:r>
+        <w:t>exactly:</w:t>
+      </w:r>
+      <w:r>
+        <w:br/>
+      </w:r>
+      <w:r>
+        <w:br/>
+        <w:t xml:space="preserve">"Mitigation: </w:t>
+      </w:r>
+      <w:r>
+        <w:t xml:space="preserve">Preferred mitigation is to remove any non-compete language in the NDA. Should the Client refuse, we need to limit the scope of the non-compete to the minimum possible (e.g. limit it to specific clients, specific people and specific </w:t>
+      </w:r>
+      <w:r>
+        <w:lastRenderedPageBreak/>
+        <w:t>scope, and limit it to a short timeframe)."</w:t>
+      </w:r>
+      <w:r>
+        <w:br/>
+      </w:r>
+      <w:r>
+        <w:br/>
+        <w:t>The complete sentence above is the approved Non-Compete Mitigation Language.</w:t>
+      </w:r>
+      <w:r>
+        <w:br/>
+      </w:r>
+      <w:r>
+        <w:br/>
+        <w:t>The wording beginning with "Mitigation:" is mandatory and MUST NOT be omitted.</w:t>
+      </w:r>
+      <w:r>
+        <w:br/>
+      </w:r>
+      <w:r>
+        <w:br/>
+        <w:t>"Mitigation:" is part of the approved mitigation language and MUST be included in the mitigating_language field.</w:t>
+      </w:r>
+      <w:r>
+        <w:br/>
+      </w:r>
+      <w:r>
+        <w:br/>
+        <w:t>Do NOT remove, replace, summarize, shorten, paraphrase, or partially reproduce the approved mitigation language.</w:t>
+      </w:r>
+      <w:r>
+        <w:br/>
+      </w:r>
+      <w:r>
+        <w:br/>
+        <w:t>Do NOT return only the sentence after "Mitigation:".</w:t>
+      </w:r>
+      <w:r>
+        <w:br/>
+      </w:r>
+      <w:r>
+        <w:br/>
+        <w:t>Return the approved mitigation language exactly as written above.</w:t>
+      </w:r>
+      <w:r>
+        <w:br/>
+      </w:r>
+      <w:r>
+        <w:br/>
+        <w:t>If risk_triggered = false, mitigating_language MUST be null.</w:t>
+      </w:r>
+    </w:p>
+    <w:p>
+      <w:pPr>
         <w:numPr>
           <w:ilvl w:val="0"/>
           <w:numId w:val="12"/>
         </w:numPr>
-      </w:pPr>
-      <w:r>
-        <w:t xml:space="preserve">If </w:t>
-      </w:r>
-      <w:proofErr w:type="spellStart"/>
-      <w:r>
-        <w:t>risk_triggered</w:t>
-      </w:r>
-      <w:proofErr w:type="spellEnd"/>
-      <w:r>
-        <w:t xml:space="preserve"> = false, </w:t>
-      </w:r>
-      <w:proofErr w:type="spellStart"/>
-      <w:r>
-        <w:t>mitigating_language</w:t>
-      </w:r>
-      <w:proofErr w:type="spellEnd"/>
-      <w:r>
-        <w:t xml:space="preserve"> MUST be null.</w:t>
-      </w:r>
-    </w:p>
-    <w:p>
-      <w:pPr>
-        <w:pStyle w:val="ListParagraph"/>
+        <w:spacing w:line="278" w:lineRule="auto"/>
+        <w:contextualSpacing/>
+      </w:pPr>
+      <w:r>
+        <w:t>If risk_triggered = false, mitigating_language MUST be null.</w:t>
+      </w:r>
+    </w:p>
+    <w:p>
+      <w:pPr>
         <w:numPr>
           <w:ilvl w:val="0"/>
           <w:numId w:val="12"/>
         </w:numPr>
-      </w:pPr>
-      <w:proofErr w:type="spellStart"/>
-      <w:r>
-        <w:t>mitigating_language</w:t>
-      </w:r>
-      <w:proofErr w:type="spellEnd"/>
-      <w:r>
-        <w:t xml:space="preserve"> MUST NOT include [DEL] markers.</w:t>
-      </w:r>
-    </w:p>
-    <w:p>
-      <w:pPr>
-        <w:pStyle w:val="ListParagraph"/>
+        <w:spacing w:line="278" w:lineRule="auto"/>
+        <w:contextualSpacing/>
+      </w:pPr>
+      <w:r>
+        <w:t>mitigating_language MUST NOT include [DEL] markers.</w:t>
+      </w:r>
+    </w:p>
+    <w:p>
+      <w:pPr>
         <w:numPr>
           <w:ilvl w:val="0"/>
           <w:numId w:val="12"/>
         </w:numPr>
-      </w:pPr>
-      <w:proofErr w:type="spellStart"/>
-      <w:r>
-        <w:t>mitigating_language</w:t>
-      </w:r>
-      <w:proofErr w:type="spellEnd"/>
-      <w:r>
-        <w:t xml:space="preserve"> MUST NOT include the original NDA clause.</w:t>
-      </w:r>
-    </w:p>
-    <w:p>
-      <w:pPr>
-        <w:pStyle w:val="ListParagraph"/>
+        <w:spacing w:line="278" w:lineRule="auto"/>
+        <w:contextualSpacing/>
+      </w:pPr>
+      <w:r>
+        <w:t>mitigating_language MUST NOT include the original NDA clause.</w:t>
+      </w:r>
+    </w:p>
+    <w:p>
+      <w:pPr>
         <w:numPr>
           <w:ilvl w:val="0"/>
           <w:numId w:val="12"/>
         </w:numPr>
-      </w:pPr>
-      <w:proofErr w:type="spellStart"/>
-      <w:r>
-        <w:lastRenderedPageBreak/>
-        <w:t>mitigating_language</w:t>
-      </w:r>
-      <w:proofErr w:type="spellEnd"/>
-      <w:r>
-        <w:t xml:space="preserve"> MUST NOT be replaced with "Mandatory legal review required. No auto-mitigation permitted."</w:t>
-      </w:r>
-    </w:p>
-    <w:p>
-      <w:pPr>
-        <w:pStyle w:val="ListParagraph"/>
+        <w:spacing w:line="278" w:lineRule="auto"/>
+        <w:contextualSpacing/>
+      </w:pPr>
+      <w:r>
+        <w:t>mitigating_language MUST NOT be replaced with "Mandatory legal review required. No auto-mitigation permitted."</w:t>
+      </w:r>
+    </w:p>
+    <w:p>
+      <w:pPr>
         <w:numPr>
           <w:ilvl w:val="0"/>
           <w:numId w:val="12"/>
         </w:numPr>
-      </w:pPr>
-      <w:r>
-        <w:t xml:space="preserve">Deletion markers, if used, must appear only in </w:t>
-      </w:r>
-      <w:proofErr w:type="spellStart"/>
-      <w:r>
-        <w:t>clean_nda_fragment</w:t>
-      </w:r>
-      <w:proofErr w:type="spellEnd"/>
-      <w:r>
-        <w:t xml:space="preserve"> or deletion output, not in mitigating_language.</w:t>
-      </w:r>
-      <w:r>
-        <w:t>4. Detection Guidance – Clause</w:t>
+        <w:spacing w:line="278" w:lineRule="auto"/>
+        <w:contextualSpacing/>
+      </w:pPr>
+      <w:r>
+        <w:t>Deletion markers, if used, must appear only in clean_nda_fragment or deletion output, not in mitigating_language.4. Detection Guidance – Clause</w:t>
       </w:r>
       <w:r>
         <w:noBreakHyphen/>
@@ -406,6 +441,9 @@
       </w:r>
     </w:p>
     <w:p>
+      <w:pPr>
+        <w:spacing w:line="278" w:lineRule="auto"/>
+      </w:pPr>
       <w:r>
         <w:rPr>
           <w:b/>
@@ -428,17 +466,10 @@
           <w:ilvl w:val="0"/>
           <w:numId w:val="4"/>
         </w:numPr>
-      </w:pPr>
-      <w:r>
-        <w:t xml:space="preserve">Restrictions preventing Accenture from competing with the </w:t>
-      </w:r>
-      <w:proofErr w:type="gramStart"/>
-      <w:r>
-        <w:t>counterparty</w:t>
-      </w:r>
-      <w:proofErr w:type="gramEnd"/>
-      <w:r>
-        <w:t>.</w:t>
+        <w:spacing w:line="278" w:lineRule="auto"/>
+      </w:pPr>
+      <w:r>
+        <w:t>Restrictions preventing Accenture from competing with the counterparty.</w:t>
       </w:r>
     </w:p>
     <w:p>
@@ -447,6 +478,7 @@
           <w:ilvl w:val="0"/>
           <w:numId w:val="4"/>
         </w:numPr>
+        <w:spacing w:line="278" w:lineRule="auto"/>
       </w:pPr>
       <w:r>
         <w:t>Exclusivity obligations requiring Accenture to deal only with one party.</w:t>
@@ -458,17 +490,10 @@
           <w:ilvl w:val="0"/>
           <w:numId w:val="4"/>
         </w:numPr>
-      </w:pPr>
-      <w:r>
-        <w:t xml:space="preserve">Circumvention restrictions </w:t>
-      </w:r>
-      <w:proofErr w:type="gramStart"/>
-      <w:r>
-        <w:t>preventing</w:t>
-      </w:r>
-      <w:proofErr w:type="gramEnd"/>
-      <w:r>
-        <w:t xml:space="preserve"> direct third</w:t>
+        <w:spacing w:line="278" w:lineRule="auto"/>
+      </w:pPr>
+      <w:r>
+        <w:t>Circumvention restrictions preventing direct third</w:t>
       </w:r>
       <w:r>
         <w:noBreakHyphen/>
@@ -481,6 +506,7 @@
           <w:ilvl w:val="0"/>
           <w:numId w:val="4"/>
         </w:numPr>
+        <w:spacing w:line="278" w:lineRule="auto"/>
       </w:pPr>
       <w:r>
         <w:t>Non</w:t>
@@ -496,17 +522,10 @@
           <w:ilvl w:val="0"/>
           <w:numId w:val="4"/>
         </w:numPr>
-      </w:pPr>
-      <w:r>
-        <w:t xml:space="preserve">Obligations </w:t>
-      </w:r>
-      <w:proofErr w:type="gramStart"/>
-      <w:r>
-        <w:t>requiring</w:t>
-      </w:r>
-      <w:proofErr w:type="gramEnd"/>
-      <w:r>
-        <w:t xml:space="preserve"> Accenture to disclose, notify, indicate, or report whether it is contracted to, working for, consulting for, or otherwise providing services to a direct competitor of the client.</w:t>
+        <w:spacing w:line="278" w:lineRule="auto"/>
+      </w:pPr>
+      <w:r>
+        <w:t>Obligations requiring Accenture to disclose, notify, indicate, or report whether it is contracted to, working for, consulting for, or otherwise providing services to a direct competitor of the client.</w:t>
       </w:r>
     </w:p>
     <w:p>
@@ -515,6 +534,7 @@
           <w:ilvl w:val="0"/>
           <w:numId w:val="4"/>
         </w:numPr>
+        <w:spacing w:line="278" w:lineRule="auto"/>
       </w:pPr>
       <w:r>
         <w:t>Competitor relationship disclosure obligations tied to existing or potential work with a client competitor.</w:t>
@@ -526,12 +546,17 @@
           <w:ilvl w:val="0"/>
           <w:numId w:val="4"/>
         </w:numPr>
-      </w:pPr>
-      <w:r>
+        <w:spacing w:line="278" w:lineRule="auto"/>
+      </w:pPr>
+      <w:r>
+        <w:lastRenderedPageBreak/>
         <w:t>Clauses requiring immediate notification of competitor work, competitor consulting, or competitor client relationships.</w:t>
       </w:r>
     </w:p>
     <w:p>
+      <w:pPr>
+        <w:spacing w:line="278" w:lineRule="auto"/>
+      </w:pPr>
       <w:r>
         <w:rPr>
           <w:b/>
@@ -546,21 +571,14 @@
           <w:ilvl w:val="0"/>
           <w:numId w:val="5"/>
         </w:numPr>
-      </w:pPr>
-      <w:r>
-        <w:t xml:space="preserve">Independent development </w:t>
-      </w:r>
-      <w:proofErr w:type="gramStart"/>
-      <w:r>
-        <w:t>carve</w:t>
+        <w:spacing w:line="278" w:lineRule="auto"/>
+      </w:pPr>
+      <w:r>
+        <w:t>Independent development carve</w:t>
       </w:r>
       <w:r>
         <w:noBreakHyphen/>
-        <w:t>outs</w:t>
-      </w:r>
-      <w:proofErr w:type="gramEnd"/>
-      <w:r>
-        <w:t>.</w:t>
+        <w:t>outs.</w:t>
       </w:r>
     </w:p>
     <w:p>
@@ -569,6 +587,7 @@
           <w:ilvl w:val="0"/>
           <w:numId w:val="5"/>
         </w:numPr>
+        <w:spacing w:line="278" w:lineRule="auto"/>
       </w:pPr>
       <w:r>
         <w:t>Confidentiality</w:t>
@@ -584,6 +603,7 @@
           <w:ilvl w:val="0"/>
           <w:numId w:val="5"/>
         </w:numPr>
+        <w:spacing w:line="278" w:lineRule="auto"/>
       </w:pPr>
       <w:r>
         <w:t>Clauses clarifying that receipt of confidential information does not limit competitive activity.</w:t>
@@ -591,6 +611,7 @@
     </w:p>
     <w:p>
       <w:pPr>
+        <w:spacing w:line="278" w:lineRule="auto"/>
         <w:rPr>
           <w:b/>
           <w:bCs/>
@@ -623,6 +644,7 @@
           </w:tcPr>
           <w:p>
             <w:pPr>
+              <w:spacing w:line="240" w:lineRule="auto"/>
               <w:rPr>
                 <w:b/>
                 <w:bCs/>
@@ -644,6 +666,7 @@
           </w:tcPr>
           <w:p>
             <w:pPr>
+              <w:spacing w:line="240" w:lineRule="auto"/>
               <w:rPr>
                 <w:b/>
                 <w:bCs/>
@@ -665,6 +688,7 @@
           </w:tcPr>
           <w:p>
             <w:pPr>
+              <w:spacing w:line="240" w:lineRule="auto"/>
               <w:rPr>
                 <w:b/>
                 <w:bCs/>
@@ -688,6 +712,7 @@
           </w:tcPr>
           <w:p>
             <w:pPr>
+              <w:spacing w:line="240" w:lineRule="auto"/>
               <w:rPr>
                 <w:b/>
                 <w:bCs/>
@@ -709,6 +734,7 @@
           </w:tcPr>
           <w:p>
             <w:pPr>
+              <w:spacing w:line="240" w:lineRule="auto"/>
               <w:rPr>
                 <w:b/>
                 <w:bCs/>
@@ -725,49 +751,39 @@
             <w:vAlign w:val="center"/>
           </w:tcPr>
           <w:p>
-            <w:proofErr w:type="spellStart"/>
+            <w:pPr>
+              <w:spacing w:line="240" w:lineRule="auto"/>
+            </w:pPr>
             <w:r>
-              <w:t>risk_triggered</w:t>
-            </w:r>
-            <w:proofErr w:type="spellEnd"/>
-            <w:r>
-              <w:t xml:space="preserve"> = true;</w:t>
-            </w:r>
-          </w:p>
-          <w:p>
-            <w:proofErr w:type="spellStart"/>
-            <w:r>
-              <w:t>escalation_only</w:t>
-            </w:r>
-            <w:proofErr w:type="spellEnd"/>
-            <w:r>
-              <w:t xml:space="preserve"> = false;</w:t>
-            </w:r>
-          </w:p>
-          <w:p>
-            <w:proofErr w:type="spellStart"/>
-            <w:r>
-              <w:t>mitigating_language</w:t>
-            </w:r>
-            <w:proofErr w:type="spellEnd"/>
-            <w:r>
-              <w:t xml:space="preserve"> = static mitigation language;</w:t>
+              <w:t>risk_triggered = true;</w:t>
             </w:r>
           </w:p>
           <w:p>
             <w:pPr>
+              <w:spacing w:line="240" w:lineRule="auto"/>
+            </w:pPr>
+            <w:r>
+              <w:t>escalation_only = false;</w:t>
+            </w:r>
+          </w:p>
+          <w:p>
+            <w:pPr>
+              <w:spacing w:line="240" w:lineRule="auto"/>
+            </w:pPr>
+            <w:r>
+              <w:t>mitigating_language = static mitigation language;</w:t>
+            </w:r>
+          </w:p>
+          <w:p>
+            <w:pPr>
+              <w:spacing w:line="240" w:lineRule="auto"/>
               <w:rPr>
                 <w:b/>
                 <w:bCs/>
               </w:rPr>
             </w:pPr>
-            <w:proofErr w:type="spellStart"/>
             <w:r>
-              <w:t>clean_nda_fragment</w:t>
-            </w:r>
-            <w:proofErr w:type="spellEnd"/>
-            <w:r>
-              <w:t xml:space="preserve"> = clause with [DEL] markers</w:t>
+              <w:t>clean_nda_fragment = clause with [DEL] markers</w:t>
             </w:r>
           </w:p>
         </w:tc>
@@ -780,6 +796,7 @@
           </w:tcPr>
           <w:p>
             <w:pPr>
+              <w:spacing w:line="240" w:lineRule="auto"/>
               <w:rPr>
                 <w:b/>
                 <w:bCs/>
@@ -801,6 +818,7 @@
           </w:tcPr>
           <w:p>
             <w:pPr>
+              <w:spacing w:line="240" w:lineRule="auto"/>
               <w:rPr>
                 <w:b/>
                 <w:bCs/>
@@ -817,50 +835,39 @@
             <w:vAlign w:val="center"/>
           </w:tcPr>
           <w:p>
-            <w:proofErr w:type="spellStart"/>
+            <w:pPr>
+              <w:spacing w:line="240" w:lineRule="auto"/>
+            </w:pPr>
             <w:r>
-              <w:t>risk_triggered</w:t>
-            </w:r>
-            <w:proofErr w:type="spellEnd"/>
-            <w:r>
-              <w:t xml:space="preserve"> = true;</w:t>
-            </w:r>
-          </w:p>
-          <w:p>
-            <w:proofErr w:type="spellStart"/>
-            <w:r>
-              <w:t>escalation_only</w:t>
-            </w:r>
-            <w:proofErr w:type="spellEnd"/>
-            <w:r>
-              <w:t xml:space="preserve"> = true;</w:t>
-            </w:r>
-          </w:p>
-          <w:p>
-            <w:proofErr w:type="spellStart"/>
-            <w:r>
-              <w:lastRenderedPageBreak/>
-              <w:t>mitigating_language</w:t>
-            </w:r>
-            <w:proofErr w:type="spellEnd"/>
-            <w:r>
-              <w:t xml:space="preserve"> = static mitigation language;</w:t>
+              <w:t>risk_triggered = true;</w:t>
             </w:r>
           </w:p>
           <w:p>
             <w:pPr>
+              <w:spacing w:line="240" w:lineRule="auto"/>
+            </w:pPr>
+            <w:r>
+              <w:t>escalation_only = true;</w:t>
+            </w:r>
+          </w:p>
+          <w:p>
+            <w:pPr>
+              <w:spacing w:line="240" w:lineRule="auto"/>
+            </w:pPr>
+            <w:r>
+              <w:t>mitigating_language = static mitigation language;</w:t>
+            </w:r>
+          </w:p>
+          <w:p>
+            <w:pPr>
+              <w:spacing w:line="240" w:lineRule="auto"/>
               <w:rPr>
                 <w:b/>
                 <w:bCs/>
               </w:rPr>
             </w:pPr>
-            <w:proofErr w:type="spellStart"/>
             <w:r>
-              <w:t>clean_nda_fragment</w:t>
-            </w:r>
-            <w:proofErr w:type="spellEnd"/>
-            <w:r>
-              <w:t xml:space="preserve"> = null</w:t>
+              <w:t>clean_nda_fragment = null</w:t>
             </w:r>
           </w:p>
         </w:tc>
@@ -873,6 +880,7 @@
           </w:tcPr>
           <w:p>
             <w:pPr>
+              <w:spacing w:line="240" w:lineRule="auto"/>
               <w:rPr>
                 <w:b/>
                 <w:bCs/>
@@ -883,7 +891,6 @@
                 <w:b/>
                 <w:bCs/>
               </w:rPr>
-              <w:lastRenderedPageBreak/>
               <w:t>Clause is confidentiality</w:t>
             </w:r>
             <w:r>
@@ -911,6 +918,7 @@
           </w:tcPr>
           <w:p>
             <w:pPr>
+              <w:spacing w:line="240" w:lineRule="auto"/>
               <w:rPr>
                 <w:b/>
                 <w:bCs/>
@@ -927,17 +935,16 @@
             <w:vAlign w:val="center"/>
           </w:tcPr>
           <w:p>
-            <w:proofErr w:type="spellStart"/>
+            <w:pPr>
+              <w:spacing w:line="240" w:lineRule="auto"/>
+            </w:pPr>
             <w:r>
-              <w:t>risk_triggered</w:t>
-            </w:r>
-            <w:proofErr w:type="spellEnd"/>
-            <w:r>
-              <w:t xml:space="preserve"> = false;</w:t>
+              <w:t>risk_triggered = false;</w:t>
             </w:r>
           </w:p>
           <w:p>
             <w:pPr>
+              <w:spacing w:line="240" w:lineRule="auto"/>
               <w:rPr>
                 <w:b/>
                 <w:bCs/>
@@ -952,6 +959,7 @@
     </w:tbl>
     <w:p>
       <w:pPr>
+        <w:spacing w:line="278" w:lineRule="auto"/>
         <w:rPr>
           <w:b/>
           <w:bCs/>
@@ -960,6 +968,7 @@
     </w:p>
     <w:p>
       <w:pPr>
+        <w:spacing w:line="278" w:lineRule="auto"/>
         <w:rPr>
           <w:b/>
           <w:bCs/>
@@ -982,23 +991,21 @@
       </w:r>
     </w:p>
     <w:p>
+      <w:pPr>
+        <w:spacing w:line="278" w:lineRule="auto"/>
+      </w:pPr>
       <w:r>
         <w:t>When Non</w:t>
       </w:r>
       <w:r>
         <w:noBreakHyphen/>
-        <w:t>Compete Risk is triggered, the risk description shown on screen must use the following text (stored in KB/</w:t>
-      </w:r>
-      <w:proofErr w:type="spellStart"/>
-      <w:r>
-        <w:t>rules_text</w:t>
-      </w:r>
-      <w:proofErr w:type="spellEnd"/>
-      <w:r>
-        <w:t>):</w:t>
-      </w:r>
-    </w:p>
-    <w:p>
+        <w:t>Compete Risk is triggered, the risk description shown on screen must use the following text (stored in KB/rules_text):</w:t>
+      </w:r>
+    </w:p>
+    <w:p>
+      <w:pPr>
+        <w:spacing w:line="278" w:lineRule="auto"/>
+      </w:pPr>
       <w:r>
         <w:t>“This NDA has been identified as having a non</w:t>
       </w:r>
@@ -1013,33 +1020,10 @@
           <w:ilvl w:val="0"/>
           <w:numId w:val="6"/>
         </w:numPr>
-      </w:pPr>
-      <w:r>
-        <w:t xml:space="preserve">If </w:t>
-      </w:r>
-      <w:proofErr w:type="spellStart"/>
-      <w:r>
-        <w:t>risk_triggered</w:t>
-      </w:r>
-      <w:proofErr w:type="spellEnd"/>
-      <w:r>
-        <w:t xml:space="preserve"> = true: populate </w:t>
-      </w:r>
-      <w:proofErr w:type="spellStart"/>
-      <w:r>
-        <w:t>risk_description</w:t>
-      </w:r>
-      <w:proofErr w:type="spellEnd"/>
-      <w:r>
-        <w:t xml:space="preserve"> using the static text from </w:t>
-      </w:r>
-      <w:proofErr w:type="spellStart"/>
-      <w:r>
-        <w:t>rules_text</w:t>
-      </w:r>
-      <w:proofErr w:type="spellEnd"/>
-      <w:r>
-        <w:t>.</w:t>
+        <w:spacing w:line="278" w:lineRule="auto"/>
+      </w:pPr>
+      <w:r>
+        <w:t>If risk_triggered = true: populate risk_description using the static text from rules_text.</w:t>
       </w:r>
     </w:p>
     <w:p>
@@ -1048,25 +1032,10 @@
           <w:ilvl w:val="0"/>
           <w:numId w:val="6"/>
         </w:numPr>
-      </w:pPr>
-      <w:r>
-        <w:t xml:space="preserve">If API </w:t>
-      </w:r>
-      <w:proofErr w:type="gramStart"/>
-      <w:r>
-        <w:t>fails:</w:t>
-      </w:r>
-      <w:proofErr w:type="gramEnd"/>
-      <w:r>
-        <w:t xml:space="preserve"> retrieve </w:t>
-      </w:r>
-      <w:proofErr w:type="spellStart"/>
-      <w:r>
-        <w:t>risk_description</w:t>
-      </w:r>
-      <w:proofErr w:type="spellEnd"/>
-      <w:r>
-        <w:t xml:space="preserve"> from fallback KB.</w:t>
+        <w:spacing w:line="278" w:lineRule="auto"/>
+      </w:pPr>
+      <w:r>
+        <w:t>If API fails: retrieve risk_description from fallback KB.</w:t>
       </w:r>
     </w:p>
     <w:p>
@@ -1075,25 +1044,10 @@
           <w:ilvl w:val="0"/>
           <w:numId w:val="6"/>
         </w:numPr>
-      </w:pPr>
-      <w:r>
-        <w:t xml:space="preserve">If </w:t>
-      </w:r>
-      <w:proofErr w:type="spellStart"/>
-      <w:r>
-        <w:t>risk_triggered</w:t>
-      </w:r>
-      <w:proofErr w:type="spellEnd"/>
-      <w:r>
-        <w:t xml:space="preserve"> = false: set </w:t>
-      </w:r>
-      <w:proofErr w:type="spellStart"/>
-      <w:r>
-        <w:t>risk_description</w:t>
-      </w:r>
-      <w:proofErr w:type="spellEnd"/>
-      <w:r>
-        <w:t xml:space="preserve"> = null.</w:t>
+        <w:spacing w:line="278" w:lineRule="auto"/>
+      </w:pPr>
+      <w:r>
+        <w:t>If risk_triggered = false: set risk_description = null.</w:t>
       </w:r>
     </w:p>
     <w:p>
@@ -1102,17 +1056,11 @@
           <w:ilvl w:val="0"/>
           <w:numId w:val="6"/>
         </w:numPr>
-      </w:pPr>
-      <w:r>
-        <w:t xml:space="preserve">The presence or absence of </w:t>
-      </w:r>
-      <w:proofErr w:type="spellStart"/>
-      <w:r>
-        <w:t>risk_description</w:t>
-      </w:r>
-      <w:proofErr w:type="spellEnd"/>
-      <w:r>
-        <w:t xml:space="preserve"> MUST NOT affect detection, escalation, or mitigation logic.</w:t>
+        <w:spacing w:line="278" w:lineRule="auto"/>
+      </w:pPr>
+      <w:r>
+        <w:lastRenderedPageBreak/>
+        <w:t>The presence or absence of risk_description MUST NOT affect detection, escalation, or mitigation logic.</w:t>
       </w:r>
     </w:p>
     <w:p>
@@ -1121,6 +1069,7 @@
           <w:ilvl w:val="0"/>
           <w:numId w:val="6"/>
         </w:numPr>
+        <w:spacing w:line="278" w:lineRule="auto"/>
       </w:pPr>
       <w:r>
         <w:t>The field is strictly informational and orchestrator</w:t>
@@ -1132,6 +1081,7 @@
     </w:p>
     <w:p>
       <w:pPr>
+        <w:spacing w:line="278" w:lineRule="auto"/>
         <w:rPr>
           <w:b/>
           <w:bCs/>
@@ -1142,57 +1092,33 @@
           <w:b/>
           <w:bCs/>
         </w:rPr>
-        <w:t xml:space="preserve">7. </w:t>
-      </w:r>
-      <w:r>
-        <w:rPr>
-          <w:b/>
-          <w:bCs/>
-        </w:rPr>
-        <w:t>Static Mitigation Rule Guidance</w:t>
-      </w:r>
-    </w:p>
-    <w:p>
-      <w:r>
-        <w:t xml:space="preserve">When </w:t>
-      </w:r>
-      <w:proofErr w:type="spellStart"/>
-      <w:r>
-        <w:t>risk_triggered</w:t>
-      </w:r>
-      <w:proofErr w:type="spellEnd"/>
-      <w:r>
-        <w:t xml:space="preserve"> = true, the agent MUST always return the following static mitigation language: </w:t>
-      </w:r>
-      <w:r>
-        <w:br/>
-      </w:r>
-      <w:r>
-        <w:t>“</w:t>
-      </w:r>
-      <w:r>
-        <w:t>Mit</w:t>
-      </w:r>
-      <w:r>
-        <w:t>i</w:t>
-      </w:r>
-      <w:r>
-        <w:t>g</w:t>
-      </w:r>
-      <w:r>
-        <w:t>a</w:t>
-      </w:r>
-      <w:r>
-        <w:t xml:space="preserve">tion: </w:t>
-      </w:r>
-      <w:r>
-        <w:t>Preferred mitigation is to remove any non-compete language in the NDA. Should the Client refuse, we need to limit the scope of the non-compete to the minimum possible (e.g. limit it to specific clients, specific people and specific scope, and limit it to a short timeframe).</w:t>
-      </w:r>
-      <w:r>
-        <w:t>”</w:t>
-      </w:r>
-    </w:p>
-    <w:p>
+        <w:t>7. Static Mitigation Rule Guidance</w:t>
+      </w:r>
+    </w:p>
+    <w:p>
+      <w:r>
+        <w:t xml:space="preserve">When risk_triggered = true, the agent MUST always return the </w:t>
+      </w:r>
+      <w:r>
+        <w:t>approved</w:t>
+      </w:r>
+      <w:r>
+        <w:t xml:space="preserve"> static mitigation language</w:t>
+      </w:r>
+      <w:r>
+        <w:t xml:space="preserve"> defined</w:t>
+      </w:r>
+      <w:r>
+        <w:t xml:space="preserve"> in </w:t>
+      </w:r>
+      <w:r>
+        <w:t>Section 3 exactly as written.</w:t>
+      </w:r>
+    </w:p>
+    <w:p>
+      <w:pPr>
+        <w:spacing w:line="278" w:lineRule="auto"/>
+      </w:pPr>
       <w:r>
         <w:t>Rules:</w:t>
       </w:r>
@@ -1206,7 +1132,7 @@
         </w:numPr>
       </w:pPr>
       <w:r>
-        <w:t>The mitigation language is static and MUST NOT be rewritten, summarized, shortened, or customized.</w:t>
+        <w:t>The approved mitigation language begins with "Mitigation:" and that prefix is mandatory.</w:t>
       </w:r>
     </w:p>
     <w:p>
@@ -1218,7 +1144,7 @@
         </w:numPr>
       </w:pPr>
       <w:r>
-        <w:t>The mitigation language MUST NOT include the original clause text.</w:t>
+        <w:t>The mitigation language MUST be returned exactly as defined in Section 3.</w:t>
       </w:r>
     </w:p>
     <w:p>
@@ -1230,15 +1156,7 @@
         </w:numPr>
       </w:pPr>
       <w:r>
-        <w:t>The mitigation language MUST NOT use [[DEL</w:t>
-      </w:r>
-      <w:proofErr w:type="gramStart"/>
-      <w:r>
-        <w:t>]]...</w:t>
-      </w:r>
-      <w:proofErr w:type="gramEnd"/>
-      <w:r>
-        <w:t>[/DEL] format.</w:t>
+        <w:t>The mitigation language MUST NOT be rewritten, summarized, shortened, customized, reformatted, or partially reproduced.</w:t>
       </w:r>
     </w:p>
     <w:p>
@@ -1250,7 +1168,7 @@
         </w:numPr>
       </w:pPr>
       <w:r>
-        <w:t>The mitigation language MUST NOT depend on the clause wording.</w:t>
+        <w:t>The mitigation language MUST NOT include the original NDA clause.</w:t>
       </w:r>
     </w:p>
     <w:p>
@@ -1262,24 +1180,7 @@
         </w:numPr>
       </w:pPr>
       <w:r>
-        <w:lastRenderedPageBreak/>
-        <w:t xml:space="preserve">If </w:t>
-      </w:r>
-      <w:proofErr w:type="spellStart"/>
-      <w:r>
-        <w:t>risk_triggered</w:t>
-      </w:r>
-      <w:proofErr w:type="spellEnd"/>
-      <w:r>
-        <w:t xml:space="preserve"> = false, set </w:t>
-      </w:r>
-      <w:proofErr w:type="spellStart"/>
-      <w:r>
-        <w:t>mitigating_language</w:t>
-      </w:r>
-      <w:proofErr w:type="spellEnd"/>
-      <w:r>
-        <w:t xml:space="preserve"> = null.</w:t>
+        <w:t>The mitigation language MUST NOT use [[DEL]]...[/DEL] format.</w:t>
       </w:r>
     </w:p>
     <w:p>
@@ -1291,7 +1192,7 @@
         </w:numPr>
       </w:pPr>
       <w:r>
-        <w:t>The mitigation language is informational and orchestrator-facing only.</w:t>
+        <w:t>The mitigation language MUST NOT depend on the clause wording.</w:t>
       </w:r>
     </w:p>
     <w:p>
@@ -1303,16 +1204,43 @@
         </w:numPr>
       </w:pPr>
       <w:r>
+        <w:t>If risk_triggered = false, mitigating_language MUST be null.</w:t>
+      </w:r>
+    </w:p>
+    <w:p>
+      <w:pPr>
+        <w:pStyle w:val="ListParagraph"/>
+        <w:numPr>
+          <w:ilvl w:val="0"/>
+          <w:numId w:val="11"/>
+        </w:numPr>
+      </w:pPr>
+      <w:r>
+        <w:t>The mitigation language is informational and orchestrator-facing only.</w:t>
+      </w:r>
+    </w:p>
+    <w:p>
+      <w:pPr>
+        <w:pStyle w:val="ListParagraph"/>
+        <w:numPr>
+          <w:ilvl w:val="0"/>
+          <w:numId w:val="11"/>
+        </w:numPr>
+      </w:pPr>
+      <w:r>
         <w:t>The mitigation language MUST NOT affect detection, escalation, or risk reasoning.</w:t>
       </w:r>
     </w:p>
     <w:p>
       <w:pPr>
-        <w:pStyle w:val="ListParagraph"/>
-      </w:pPr>
-    </w:p>
-    <w:p>
-      <w:pPr>
+        <w:spacing w:line="278" w:lineRule="auto"/>
+        <w:ind w:left="720"/>
+        <w:contextualSpacing/>
+      </w:pPr>
+    </w:p>
+    <w:p>
+      <w:pPr>
+        <w:spacing w:line="278" w:lineRule="auto"/>
         <w:rPr>
           <w:b/>
           <w:bCs/>
@@ -1343,6 +1271,9 @@
       </w:r>
     </w:p>
     <w:p>
+      <w:pPr>
+        <w:spacing w:line="278" w:lineRule="auto"/>
+      </w:pPr>
       <w:r>
         <w:t>Do NOT trigger risk for:</w:t>
       </w:r>
@@ -1353,6 +1284,7 @@
           <w:ilvl w:val="0"/>
           <w:numId w:val="7"/>
         </w:numPr>
+        <w:spacing w:line="278" w:lineRule="auto"/>
       </w:pPr>
       <w:r>
         <w:t>Confidentiality</w:t>
@@ -1368,21 +1300,14 @@
           <w:ilvl w:val="0"/>
           <w:numId w:val="7"/>
         </w:numPr>
-      </w:pPr>
-      <w:r>
-        <w:t xml:space="preserve">Independent development </w:t>
-      </w:r>
-      <w:proofErr w:type="gramStart"/>
-      <w:r>
-        <w:t>carve</w:t>
+        <w:spacing w:line="278" w:lineRule="auto"/>
+      </w:pPr>
+      <w:r>
+        <w:t>Independent development carve</w:t>
       </w:r>
       <w:r>
         <w:noBreakHyphen/>
-        <w:t>outs</w:t>
-      </w:r>
-      <w:proofErr w:type="gramEnd"/>
-      <w:r>
-        <w:t>.</w:t>
+        <w:t>outs.</w:t>
       </w:r>
     </w:p>
     <w:p>
@@ -1391,6 +1316,7 @@
           <w:ilvl w:val="0"/>
           <w:numId w:val="7"/>
         </w:numPr>
+        <w:spacing w:line="278" w:lineRule="auto"/>
       </w:pPr>
       <w:r>
         <w:t>Clauses clarifying competitive freedom.</w:t>
@@ -1402,6 +1328,7 @@
           <w:ilvl w:val="0"/>
           <w:numId w:val="7"/>
         </w:numPr>
+        <w:spacing w:line="278" w:lineRule="auto"/>
       </w:pPr>
       <w:r>
         <w:t>Do NOT trigger where the word “competitor” appears only in a permitted-disclosure restriction, such as excluding competitor consultants from receiving Confidential Information, and the clause does not require Accenture to disclose, notify, indicate, report, restrict, stop, or avoid work with a competitor.</w:t>
@@ -1409,6 +1336,7 @@
     </w:p>
     <w:p>
       <w:pPr>
+        <w:spacing w:line="278" w:lineRule="auto"/>
         <w:rPr>
           <w:b/>
           <w:bCs/>
@@ -1423,6 +1351,9 @@
       </w:r>
     </w:p>
     <w:p>
+      <w:pPr>
+        <w:spacing w:line="278" w:lineRule="auto"/>
+      </w:pPr>
       <w:r>
         <w:rPr>
           <w:b/>
@@ -1445,8 +1376,10 @@
           <w:ilvl w:val="0"/>
           <w:numId w:val="8"/>
         </w:numPr>
-      </w:pPr>
-      <w:r>
+        <w:spacing w:line="278" w:lineRule="auto"/>
+      </w:pPr>
+      <w:r>
+        <w:lastRenderedPageBreak/>
         <w:t>“Supplier agrees that, during a period of two (2) years… it will not… persuade, induce, or attempt to persuade or induce any customer of Grange or its affiliates to cease purchasing goods or services…”</w:t>
       </w:r>
     </w:p>
@@ -1456,6 +1389,7 @@
           <w:ilvl w:val="0"/>
           <w:numId w:val="8"/>
         </w:numPr>
+        <w:spacing w:line="278" w:lineRule="auto"/>
       </w:pPr>
       <w:r>
         <w:t>“Throughout the duration of the Project and for a period of 6 months… the Consultant shall not enter into any arrangement with a Client Competitor…”</w:t>
@@ -1467,6 +1401,7 @@
           <w:ilvl w:val="0"/>
           <w:numId w:val="8"/>
         </w:numPr>
+        <w:spacing w:line="278" w:lineRule="auto"/>
       </w:pPr>
       <w:r>
         <w:t>“The parties will deal with one another on an exclusive basis for a minimum period…”</w:t>
@@ -1478,12 +1413,16 @@
           <w:ilvl w:val="0"/>
           <w:numId w:val="8"/>
         </w:numPr>
+        <w:spacing w:line="278" w:lineRule="auto"/>
       </w:pPr>
       <w:r>
         <w:t>“We will indicate to you immediately if we believe that we are contracted to, working for, or consulting for any company which is a direct competitor of the Client.”</w:t>
       </w:r>
     </w:p>
     <w:p>
+      <w:pPr>
+        <w:spacing w:line="278" w:lineRule="auto"/>
+      </w:pPr>
       <w:r>
         <w:rPr>
           <w:b/>
@@ -1498,6 +1437,7 @@
           <w:ilvl w:val="0"/>
           <w:numId w:val="9"/>
         </w:numPr>
+        <w:spacing w:line="278" w:lineRule="auto"/>
       </w:pPr>
       <w:r>
         <w:t>“Nothing in this Agreement shall limit in any way any Party’s ability to develop technologies or products… that compete with the other Party’s technology…”</w:t>
@@ -1509,6 +1449,7 @@
           <w:ilvl w:val="0"/>
           <w:numId w:val="9"/>
         </w:numPr>
+        <w:spacing w:line="278" w:lineRule="auto"/>
       </w:pPr>
       <w:r>
         <w:t>“The mere receipt of Confidential Information… will not prevent or limit either party from developing, making or marketing products or services…”</w:t>
@@ -1516,6 +1457,7 @@
     </w:p>
     <w:p>
       <w:pPr>
+        <w:spacing w:line="278" w:lineRule="auto"/>
         <w:rPr>
           <w:b/>
           <w:bCs/>
@@ -1530,189 +1472,137 @@
       </w:r>
     </w:p>
     <w:p>
+      <w:pPr>
+        <w:spacing w:line="278" w:lineRule="auto"/>
+      </w:pPr>
+      <w:r>
+        <w:t>RESPONSE_START</w:t>
+      </w:r>
+    </w:p>
+    <w:p>
+      <w:pPr>
+        <w:spacing w:line="278" w:lineRule="auto"/>
+      </w:pPr>
+      <w:r>
+        <w:t>risk_triggered: [true/false/null]</w:t>
+      </w:r>
+    </w:p>
+    <w:p>
+      <w:pPr>
+        <w:spacing w:line="278" w:lineRule="auto"/>
+      </w:pPr>
+      <w:r>
+        <w:t>escalation_only: [true/false/null]</w:t>
+      </w:r>
+    </w:p>
+    <w:p>
+      <w:pPr>
+        <w:spacing w:line="278" w:lineRule="auto"/>
+      </w:pPr>
+      <w:r>
+        <w:t>risk_name: [Non-Compete/null]</w:t>
+      </w:r>
+    </w:p>
+    <w:p>
+      <w:pPr>
+        <w:spacing w:line="278" w:lineRule="auto"/>
+      </w:pPr>
+      <w:r>
+        <w:t>risk_level: [High/null]</w:t>
+      </w:r>
+    </w:p>
+    <w:p>
+      <w:pPr>
+        <w:spacing w:line="278" w:lineRule="auto"/>
+      </w:pPr>
+      <w:r>
+        <w:t>risk_description:</w:t>
+      </w:r>
+    </w:p>
+    <w:p>
+      <w:pPr>
+        <w:spacing w:line="278" w:lineRule="auto"/>
+      </w:pPr>
+      <w:r>
+        <w:t>[Static risk description from rules_text if risk_triggered = true, otherwise null]</w:t>
+      </w:r>
+    </w:p>
+    <w:p>
+      <w:pPr>
+        <w:spacing w:line="278" w:lineRule="auto"/>
+      </w:pPr>
+      <w:r>
+        <w:t>original_language:</w:t>
+      </w:r>
+    </w:p>
+    <w:p>
+      <w:pPr>
+        <w:spacing w:line="278" w:lineRule="auto"/>
+      </w:pPr>
+      <w:r>
+        <w:t>[Exact NDA clause text or null]</w:t>
+      </w:r>
+    </w:p>
+    <w:p>
+      <w:pPr>
+        <w:spacing w:line="278" w:lineRule="auto"/>
+      </w:pPr>
+      <w:r>
+        <w:t>reason_for_deletion:</w:t>
+      </w:r>
+    </w:p>
+    <w:p>
+      <w:pPr>
+        <w:spacing w:line="278" w:lineRule="auto"/>
+      </w:pPr>
+      <w:r>
+        <w:t>[Explanation or null]</w:t>
+      </w:r>
+    </w:p>
+    <w:p>
+      <w:pPr>
+        <w:spacing w:line="278" w:lineRule="auto"/>
+      </w:pPr>
+      <w:r>
+        <w:t>mitigating_language:</w:t>
+      </w:r>
+    </w:p>
+    <w:p>
+      <w:pPr>
+        <w:spacing w:line="278" w:lineRule="auto"/>
+      </w:pPr>
+      <w:r>
+        <w:t>[Static mitigation language from rules_text if risk_triggered = true, otherwise null]</w:t>
+      </w:r>
+    </w:p>
+    <w:p>
+      <w:pPr>
+        <w:spacing w:line="278" w:lineRule="auto"/>
+      </w:pPr>
       <w:r>
         <w:lastRenderedPageBreak/>
-        <w:t>RESPONSE_START</w:t>
-      </w:r>
-    </w:p>
-    <w:p>
-      <w:proofErr w:type="spellStart"/>
-      <w:r>
-        <w:t>risk_triggered</w:t>
-      </w:r>
-      <w:proofErr w:type="spellEnd"/>
-      <w:r>
-        <w:t>: [true/false/null]</w:t>
-      </w:r>
-    </w:p>
-    <w:p>
-      <w:proofErr w:type="spellStart"/>
-      <w:r>
-        <w:t>escalation_only</w:t>
-      </w:r>
-      <w:proofErr w:type="spellEnd"/>
-      <w:r>
-        <w:t>: [true/false/null]</w:t>
-      </w:r>
-    </w:p>
-    <w:p>
-      <w:proofErr w:type="spellStart"/>
-      <w:r>
-        <w:t>risk_name</w:t>
-      </w:r>
-      <w:proofErr w:type="spellEnd"/>
-      <w:r>
-        <w:t>: [</w:t>
-      </w:r>
-      <w:proofErr w:type="gramStart"/>
-      <w:r>
-        <w:t>Non-Compete</w:t>
-      </w:r>
-      <w:proofErr w:type="gramEnd"/>
-      <w:r>
-        <w:t>/null]</w:t>
-      </w:r>
-    </w:p>
-    <w:p>
-      <w:proofErr w:type="spellStart"/>
-      <w:r>
-        <w:t>risk_level</w:t>
-      </w:r>
-      <w:proofErr w:type="spellEnd"/>
-      <w:r>
-        <w:t>: [High/null]</w:t>
-      </w:r>
-    </w:p>
-    <w:p>
-      <w:proofErr w:type="spellStart"/>
-      <w:r>
-        <w:t>risk_description</w:t>
-      </w:r>
-      <w:proofErr w:type="spellEnd"/>
-      <w:r>
-        <w:t>:</w:t>
-      </w:r>
-    </w:p>
-    <w:p>
-      <w:r>
-        <w:t xml:space="preserve">[Static risk description from </w:t>
-      </w:r>
-      <w:proofErr w:type="spellStart"/>
-      <w:r>
-        <w:t>rules_text</w:t>
-      </w:r>
-      <w:proofErr w:type="spellEnd"/>
-      <w:r>
-        <w:t xml:space="preserve"> if </w:t>
-      </w:r>
-      <w:proofErr w:type="spellStart"/>
-      <w:r>
-        <w:t>risk_triggered</w:t>
-      </w:r>
-      <w:proofErr w:type="spellEnd"/>
-      <w:r>
-        <w:t xml:space="preserve"> = true, otherwise null]</w:t>
-      </w:r>
-    </w:p>
-    <w:p>
-      <w:proofErr w:type="spellStart"/>
-      <w:r>
-        <w:t>original_language</w:t>
-      </w:r>
-      <w:proofErr w:type="spellEnd"/>
-      <w:r>
-        <w:t>:</w:t>
-      </w:r>
-    </w:p>
-    <w:p>
-      <w:r>
-        <w:t>[Exact NDA clause text or null]</w:t>
-      </w:r>
-    </w:p>
-    <w:p>
-      <w:proofErr w:type="spellStart"/>
-      <w:r>
-        <w:t>reason_for_deletion</w:t>
-      </w:r>
-      <w:proofErr w:type="spellEnd"/>
-      <w:r>
-        <w:t>:</w:t>
-      </w:r>
-    </w:p>
-    <w:p>
-      <w:r>
-        <w:t>[Explanation or null]</w:t>
-      </w:r>
-    </w:p>
-    <w:p>
-      <w:proofErr w:type="spellStart"/>
-      <w:r>
-        <w:t>mitigating_language</w:t>
-      </w:r>
-      <w:proofErr w:type="spellEnd"/>
-      <w:r>
-        <w:t>:</w:t>
-      </w:r>
-    </w:p>
-    <w:p>
-      <w:r>
-        <w:t xml:space="preserve">[Static mitigation language from </w:t>
-      </w:r>
-      <w:proofErr w:type="spellStart"/>
-      <w:r>
-        <w:t>rules_text</w:t>
-      </w:r>
-      <w:proofErr w:type="spellEnd"/>
-      <w:r>
-        <w:t xml:space="preserve"> if </w:t>
-      </w:r>
-      <w:proofErr w:type="spellStart"/>
-      <w:r>
-        <w:t>risk_triggered</w:t>
-      </w:r>
-      <w:proofErr w:type="spellEnd"/>
-      <w:r>
-        <w:t xml:space="preserve"> = true, otherwise null]</w:t>
-      </w:r>
-    </w:p>
-    <w:p>
-      <w:proofErr w:type="spellStart"/>
-      <w:r>
-        <w:t>clean_nda_fragment</w:t>
-      </w:r>
-      <w:proofErr w:type="spellEnd"/>
-      <w:r>
-        <w:t>:</w:t>
-      </w:r>
-    </w:p>
-    <w:p>
-      <w:r>
-        <w:t xml:space="preserve">[Exact clause wrapped in [DEL] markers if </w:t>
-      </w:r>
-      <w:proofErr w:type="spellStart"/>
-      <w:r>
-        <w:t>risk_triggered</w:t>
-      </w:r>
-      <w:proofErr w:type="spellEnd"/>
-      <w:r>
-        <w:t xml:space="preserve"> = true and </w:t>
-      </w:r>
-      <w:proofErr w:type="spellStart"/>
-      <w:r>
-        <w:t>escalation_only</w:t>
-      </w:r>
-      <w:proofErr w:type="spellEnd"/>
-      <w:r>
-        <w:t xml:space="preserve"> = false, otherwise null]</w:t>
-      </w:r>
-    </w:p>
-    <w:p>
+        <w:t>clean_nda_fragment:</w:t>
+      </w:r>
+    </w:p>
+    <w:p>
+      <w:pPr>
+        <w:spacing w:line="278" w:lineRule="auto"/>
+      </w:pPr>
+      <w:r>
+        <w:t>[Exact clause wrapped in [DEL] markers if risk_triggered = true and escalation_only = false, otherwise null]</w:t>
+      </w:r>
+    </w:p>
+    <w:p>
+      <w:pPr>
+        <w:spacing w:line="278" w:lineRule="auto"/>
+      </w:pPr>
       <w:r>
         <w:t>RESPONSE_END</w:t>
       </w:r>
     </w:p>
     <w:p>
       <w:pPr>
+        <w:spacing w:line="278" w:lineRule="auto"/>
         <w:rPr>
           <w:b/>
           <w:bCs/>
@@ -1727,60 +1617,24 @@
       </w:r>
     </w:p>
     <w:p>
-      <w:r>
-        <w:t xml:space="preserve">If </w:t>
-      </w:r>
-      <w:proofErr w:type="spellStart"/>
-      <w:r>
-        <w:t>risk_triggered</w:t>
-      </w:r>
-      <w:proofErr w:type="spellEnd"/>
-      <w:r>
-        <w:t xml:space="preserve"> = true, </w:t>
-      </w:r>
-      <w:proofErr w:type="spellStart"/>
-      <w:r>
-        <w:t>mitigating_language</w:t>
-      </w:r>
-      <w:proofErr w:type="spellEnd"/>
-      <w:r>
-        <w:t xml:space="preserve"> MUST always be exactly:</w:t>
-      </w:r>
-    </w:p>
-    <w:p>
-      <w:r>
-        <w:t>"</w:t>
-      </w:r>
-      <w:r>
-        <w:t xml:space="preserve">Mitigation: </w:t>
-      </w:r>
-      <w:r>
-        <w:t>Preferred mitigation is to remove any non-compete language in the NDA. Should the Client refuse, we need to limit the scope of the non-compete to the minimum possible (e.g. limit it to specific clients, specific people and specific scope, and limit it to a short timeframe)."</w:t>
-      </w:r>
-    </w:p>
-    <w:p>
-      <w:r>
-        <w:t xml:space="preserve">If </w:t>
-      </w:r>
-      <w:proofErr w:type="spellStart"/>
-      <w:r>
-        <w:t>risk_triggered</w:t>
-      </w:r>
-      <w:proofErr w:type="spellEnd"/>
-      <w:r>
-        <w:t xml:space="preserve"> = false, </w:t>
-      </w:r>
-      <w:proofErr w:type="spellStart"/>
-      <w:r>
-        <w:t>mitigating_language</w:t>
-      </w:r>
-      <w:proofErr w:type="spellEnd"/>
-      <w:r>
-        <w:t xml:space="preserve"> MUST be null.</w:t>
-      </w:r>
-    </w:p>
-    <w:p>
-      <w:pPr>
+      <w:pPr>
+        <w:spacing w:line="278" w:lineRule="auto"/>
+      </w:pPr>
+      <w:r>
+        <w:t>If risk_triggered = true, mitigating_language MUST always be the approved static mitigation language defined in Section 3.</w:t>
+      </w:r>
+    </w:p>
+    <w:p>
+      <w:pPr>
+        <w:spacing w:line="278" w:lineRule="auto"/>
+      </w:pPr>
+      <w:r>
+        <w:t>If risk_triggered = false, mitigating_language MUST be null.</w:t>
+      </w:r>
+    </w:p>
+    <w:p>
+      <w:pPr>
+        <w:spacing w:line="278" w:lineRule="auto"/>
         <w:rPr>
           <w:b/>
           <w:bCs/>
@@ -1800,6 +1654,7 @@
           <w:ilvl w:val="0"/>
           <w:numId w:val="10"/>
         </w:numPr>
+        <w:spacing w:line="278" w:lineRule="auto"/>
       </w:pPr>
       <w:r>
         <w:t>Always treat non</w:t>
@@ -1815,9 +1670,9 @@
           <w:ilvl w:val="0"/>
           <w:numId w:val="10"/>
         </w:numPr>
-      </w:pPr>
-      <w:r>
-        <w:lastRenderedPageBreak/>
+        <w:spacing w:line="278" w:lineRule="auto"/>
+      </w:pPr>
+      <w:r>
         <w:t>Always standardize detected risks under Non</w:t>
       </w:r>
       <w:r>
@@ -1831,6 +1686,7 @@
           <w:ilvl w:val="0"/>
           <w:numId w:val="10"/>
         </w:numPr>
+        <w:spacing w:line="278" w:lineRule="auto"/>
       </w:pPr>
       <w:r>
         <w:t>Always apply deletion</w:t>
@@ -1846,6 +1702,7 @@
           <w:ilvl w:val="0"/>
           <w:numId w:val="10"/>
         </w:numPr>
+        <w:spacing w:line="278" w:lineRule="auto"/>
       </w:pPr>
       <w:r>
         <w:t>Never reinterpret prohibited restrictions as acceptable confidentiality terms.</w:t>
@@ -1857,11 +1714,14 @@
           <w:ilvl w:val="0"/>
           <w:numId w:val="10"/>
         </w:numPr>
+        <w:spacing w:line="278" w:lineRule="auto"/>
       </w:pPr>
       <w:r>
         <w:t>Never generate unauthorized replacement legal drafting.</w:t>
       </w:r>
     </w:p>
+    <w:p/>
+    <w:p/>
     <w:sectPr>
       <w:pgSz w:w="12240" w:h="15840"/>
       <w:pgMar w:top="1440" w:right="1440" w:bottom="1440" w:left="1440" w:header="720" w:footer="720" w:gutter="0"/>
@@ -2877,6 +2737,155 @@
     </w:lvl>
   </w:abstractNum>
   <w:abstractNum w:abstractNumId="7" w15:restartNumberingAfterBreak="0">
+    <w:nsid w:val="399D71E1"/>
+    <w:multiLevelType w:val="multilevel"/>
+    <w:tmpl w:val="4D008B82"/>
+    <w:lvl w:ilvl="0">
+      <w:start w:val="1"/>
+      <w:numFmt w:val="bullet"/>
+      <w:lvlText w:val=""/>
+      <w:lvlJc w:val="left"/>
+      <w:pPr>
+        <w:tabs>
+          <w:tab w:val="num" w:pos="720"/>
+        </w:tabs>
+        <w:ind w:left="720" w:hanging="360"/>
+      </w:pPr>
+      <w:rPr>
+        <w:rFonts w:ascii="Symbol" w:hAnsi="Symbol" w:hint="default"/>
+        <w:sz w:val="20"/>
+      </w:rPr>
+    </w:lvl>
+    <w:lvl w:ilvl="1" w:tentative="1">
+      <w:start w:val="1"/>
+      <w:numFmt w:val="bullet"/>
+      <w:lvlText w:val="o"/>
+      <w:lvlJc w:val="left"/>
+      <w:pPr>
+        <w:tabs>
+          <w:tab w:val="num" w:pos="1440"/>
+        </w:tabs>
+        <w:ind w:left="1440" w:hanging="360"/>
+      </w:pPr>
+      <w:rPr>
+        <w:rFonts w:ascii="Courier New" w:hAnsi="Courier New" w:hint="default"/>
+        <w:sz w:val="20"/>
+      </w:rPr>
+    </w:lvl>
+    <w:lvl w:ilvl="2" w:tentative="1">
+      <w:start w:val="1"/>
+      <w:numFmt w:val="bullet"/>
+      <w:lvlText w:val=""/>
+      <w:lvlJc w:val="left"/>
+      <w:pPr>
+        <w:tabs>
+          <w:tab w:val="num" w:pos="2160"/>
+        </w:tabs>
+        <w:ind w:left="2160" w:hanging="360"/>
+      </w:pPr>
+      <w:rPr>
+        <w:rFonts w:ascii="Wingdings" w:hAnsi="Wingdings" w:hint="default"/>
+        <w:sz w:val="20"/>
+      </w:rPr>
+    </w:lvl>
+    <w:lvl w:ilvl="3" w:tentative="1">
+      <w:start w:val="1"/>
+      <w:numFmt w:val="bullet"/>
+      <w:lvlText w:val=""/>
+      <w:lvlJc w:val="left"/>
+      <w:pPr>
+        <w:tabs>
+          <w:tab w:val="num" w:pos="2880"/>
+        </w:tabs>
+        <w:ind w:left="2880" w:hanging="360"/>
+      </w:pPr>
+      <w:rPr>
+        <w:rFonts w:ascii="Wingdings" w:hAnsi="Wingdings" w:hint="default"/>
+        <w:sz w:val="20"/>
+      </w:rPr>
+    </w:lvl>
+    <w:lvl w:ilvl="4" w:tentative="1">
+      <w:start w:val="1"/>
+      <w:numFmt w:val="bullet"/>
+      <w:lvlText w:val=""/>
+      <w:lvlJc w:val="left"/>
+      <w:pPr>
+        <w:tabs>
+          <w:tab w:val="num" w:pos="3600"/>
+        </w:tabs>
+        <w:ind w:left="3600" w:hanging="360"/>
+      </w:pPr>
+      <w:rPr>
+        <w:rFonts w:ascii="Wingdings" w:hAnsi="Wingdings" w:hint="default"/>
+        <w:sz w:val="20"/>
+      </w:rPr>
+    </w:lvl>
+    <w:lvl w:ilvl="5" w:tentative="1">
+      <w:start w:val="1"/>
+      <w:numFmt w:val="bullet"/>
+      <w:lvlText w:val=""/>
+      <w:lvlJc w:val="left"/>
+      <w:pPr>
+        <w:tabs>
+          <w:tab w:val="num" w:pos="4320"/>
+        </w:tabs>
+        <w:ind w:left="4320" w:hanging="360"/>
+      </w:pPr>
+      <w:rPr>
+        <w:rFonts w:ascii="Wingdings" w:hAnsi="Wingdings" w:hint="default"/>
+        <w:sz w:val="20"/>
+      </w:rPr>
+    </w:lvl>
+    <w:lvl w:ilvl="6" w:tentative="1">
+      <w:start w:val="1"/>
+      <w:numFmt w:val="bullet"/>
+      <w:lvlText w:val=""/>
+      <w:lvlJc w:val="left"/>
+      <w:pPr>
+        <w:tabs>
+          <w:tab w:val="num" w:pos="5040"/>
+        </w:tabs>
+        <w:ind w:left="5040" w:hanging="360"/>
+      </w:pPr>
+      <w:rPr>
+        <w:rFonts w:ascii="Wingdings" w:hAnsi="Wingdings" w:hint="default"/>
+        <w:sz w:val="20"/>
+      </w:rPr>
+    </w:lvl>
+    <w:lvl w:ilvl="7" w:tentative="1">
+      <w:start w:val="1"/>
+      <w:numFmt w:val="bullet"/>
+      <w:lvlText w:val=""/>
+      <w:lvlJc w:val="left"/>
+      <w:pPr>
+        <w:tabs>
+          <w:tab w:val="num" w:pos="5760"/>
+        </w:tabs>
+        <w:ind w:left="5760" w:hanging="360"/>
+      </w:pPr>
+      <w:rPr>
+        <w:rFonts w:ascii="Wingdings" w:hAnsi="Wingdings" w:hint="default"/>
+        <w:sz w:val="20"/>
+      </w:rPr>
+    </w:lvl>
+    <w:lvl w:ilvl="8" w:tentative="1">
+      <w:start w:val="1"/>
+      <w:numFmt w:val="bullet"/>
+      <w:lvlText w:val=""/>
+      <w:lvlJc w:val="left"/>
+      <w:pPr>
+        <w:tabs>
+          <w:tab w:val="num" w:pos="6480"/>
+        </w:tabs>
+        <w:ind w:left="6480" w:hanging="360"/>
+      </w:pPr>
+      <w:rPr>
+        <w:rFonts w:ascii="Wingdings" w:hAnsi="Wingdings" w:hint="default"/>
+        <w:sz w:val="20"/>
+      </w:rPr>
+    </w:lvl>
+  </w:abstractNum>
+  <w:abstractNum w:abstractNumId="8" w15:restartNumberingAfterBreak="0">
     <w:nsid w:val="4A817E8B"/>
     <w:multiLevelType w:val="multilevel"/>
     <w:tmpl w:val="ED207FB2"/>
@@ -3025,7 +3034,7 @@
       </w:rPr>
     </w:lvl>
   </w:abstractNum>
-  <w:abstractNum w:abstractNumId="8" w15:restartNumberingAfterBreak="0">
+  <w:abstractNum w:abstractNumId="9" w15:restartNumberingAfterBreak="0">
     <w:nsid w:val="56F07FCF"/>
     <w:multiLevelType w:val="hybridMultilevel"/>
     <w:tmpl w:val="FECECCE6"/>
@@ -3138,7 +3147,7 @@
       </w:rPr>
     </w:lvl>
   </w:abstractNum>
-  <w:abstractNum w:abstractNumId="9" w15:restartNumberingAfterBreak="0">
+  <w:abstractNum w:abstractNumId="10" w15:restartNumberingAfterBreak="0">
     <w:nsid w:val="60CD725E"/>
     <w:multiLevelType w:val="multilevel"/>
     <w:tmpl w:val="7ED8A12E"/>
@@ -3287,7 +3296,7 @@
       </w:rPr>
     </w:lvl>
   </w:abstractNum>
-  <w:abstractNum w:abstractNumId="10" w15:restartNumberingAfterBreak="0">
+  <w:abstractNum w:abstractNumId="11" w15:restartNumberingAfterBreak="0">
     <w:nsid w:val="690C357C"/>
     <w:multiLevelType w:val="multilevel"/>
     <w:tmpl w:val="4E520CBA"/>
@@ -3436,7 +3445,7 @@
       </w:rPr>
     </w:lvl>
   </w:abstractNum>
-  <w:abstractNum w:abstractNumId="11" w15:restartNumberingAfterBreak="0">
+  <w:abstractNum w:abstractNumId="12" w15:restartNumberingAfterBreak="0">
     <w:nsid w:val="6BA554FA"/>
     <w:multiLevelType w:val="multilevel"/>
     <w:tmpl w:val="9B2C775A"/>
@@ -3585,7 +3594,7 @@
       </w:rPr>
     </w:lvl>
   </w:abstractNum>
-  <w:abstractNum w:abstractNumId="12" w15:restartNumberingAfterBreak="0">
+  <w:abstractNum w:abstractNumId="13" w15:restartNumberingAfterBreak="0">
     <w:nsid w:val="746A6409"/>
     <w:multiLevelType w:val="hybridMultilevel"/>
     <w:tmpl w:val="072A2F8A"/>
@@ -3698,23 +3707,172 @@
       </w:rPr>
     </w:lvl>
   </w:abstractNum>
+  <w:abstractNum w:abstractNumId="14" w15:restartNumberingAfterBreak="0">
+    <w:nsid w:val="78214BE7"/>
+    <w:multiLevelType w:val="multilevel"/>
+    <w:tmpl w:val="30D4A2CE"/>
+    <w:lvl w:ilvl="0">
+      <w:start w:val="1"/>
+      <w:numFmt w:val="bullet"/>
+      <w:lvlText w:val=""/>
+      <w:lvlJc w:val="left"/>
+      <w:pPr>
+        <w:tabs>
+          <w:tab w:val="num" w:pos="720"/>
+        </w:tabs>
+        <w:ind w:left="720" w:hanging="360"/>
+      </w:pPr>
+      <w:rPr>
+        <w:rFonts w:ascii="Symbol" w:hAnsi="Symbol" w:hint="default"/>
+        <w:sz w:val="20"/>
+      </w:rPr>
+    </w:lvl>
+    <w:lvl w:ilvl="1" w:tentative="1">
+      <w:start w:val="1"/>
+      <w:numFmt w:val="bullet"/>
+      <w:lvlText w:val=""/>
+      <w:lvlJc w:val="left"/>
+      <w:pPr>
+        <w:tabs>
+          <w:tab w:val="num" w:pos="1440"/>
+        </w:tabs>
+        <w:ind w:left="1440" w:hanging="360"/>
+      </w:pPr>
+      <w:rPr>
+        <w:rFonts w:ascii="Symbol" w:hAnsi="Symbol" w:hint="default"/>
+        <w:sz w:val="20"/>
+      </w:rPr>
+    </w:lvl>
+    <w:lvl w:ilvl="2" w:tentative="1">
+      <w:start w:val="1"/>
+      <w:numFmt w:val="bullet"/>
+      <w:lvlText w:val=""/>
+      <w:lvlJc w:val="left"/>
+      <w:pPr>
+        <w:tabs>
+          <w:tab w:val="num" w:pos="2160"/>
+        </w:tabs>
+        <w:ind w:left="2160" w:hanging="360"/>
+      </w:pPr>
+      <w:rPr>
+        <w:rFonts w:ascii="Symbol" w:hAnsi="Symbol" w:hint="default"/>
+        <w:sz w:val="20"/>
+      </w:rPr>
+    </w:lvl>
+    <w:lvl w:ilvl="3" w:tentative="1">
+      <w:start w:val="1"/>
+      <w:numFmt w:val="bullet"/>
+      <w:lvlText w:val=""/>
+      <w:lvlJc w:val="left"/>
+      <w:pPr>
+        <w:tabs>
+          <w:tab w:val="num" w:pos="2880"/>
+        </w:tabs>
+        <w:ind w:left="2880" w:hanging="360"/>
+      </w:pPr>
+      <w:rPr>
+        <w:rFonts w:ascii="Symbol" w:hAnsi="Symbol" w:hint="default"/>
+        <w:sz w:val="20"/>
+      </w:rPr>
+    </w:lvl>
+    <w:lvl w:ilvl="4" w:tentative="1">
+      <w:start w:val="1"/>
+      <w:numFmt w:val="bullet"/>
+      <w:lvlText w:val=""/>
+      <w:lvlJc w:val="left"/>
+      <w:pPr>
+        <w:tabs>
+          <w:tab w:val="num" w:pos="3600"/>
+        </w:tabs>
+        <w:ind w:left="3600" w:hanging="360"/>
+      </w:pPr>
+      <w:rPr>
+        <w:rFonts w:ascii="Symbol" w:hAnsi="Symbol" w:hint="default"/>
+        <w:sz w:val="20"/>
+      </w:rPr>
+    </w:lvl>
+    <w:lvl w:ilvl="5" w:tentative="1">
+      <w:start w:val="1"/>
+      <w:numFmt w:val="bullet"/>
+      <w:lvlText w:val=""/>
+      <w:lvlJc w:val="left"/>
+      <w:pPr>
+        <w:tabs>
+          <w:tab w:val="num" w:pos="4320"/>
+        </w:tabs>
+        <w:ind w:left="4320" w:hanging="360"/>
+      </w:pPr>
+      <w:rPr>
+        <w:rFonts w:ascii="Symbol" w:hAnsi="Symbol" w:hint="default"/>
+        <w:sz w:val="20"/>
+      </w:rPr>
+    </w:lvl>
+    <w:lvl w:ilvl="6" w:tentative="1">
+      <w:start w:val="1"/>
+      <w:numFmt w:val="bullet"/>
+      <w:lvlText w:val=""/>
+      <w:lvlJc w:val="left"/>
+      <w:pPr>
+        <w:tabs>
+          <w:tab w:val="num" w:pos="5040"/>
+        </w:tabs>
+        <w:ind w:left="5040" w:hanging="360"/>
+      </w:pPr>
+      <w:rPr>
+        <w:rFonts w:ascii="Symbol" w:hAnsi="Symbol" w:hint="default"/>
+        <w:sz w:val="20"/>
+      </w:rPr>
+    </w:lvl>
+    <w:lvl w:ilvl="7" w:tentative="1">
+      <w:start w:val="1"/>
+      <w:numFmt w:val="bullet"/>
+      <w:lvlText w:val=""/>
+      <w:lvlJc w:val="left"/>
+      <w:pPr>
+        <w:tabs>
+          <w:tab w:val="num" w:pos="5760"/>
+        </w:tabs>
+        <w:ind w:left="5760" w:hanging="360"/>
+      </w:pPr>
+      <w:rPr>
+        <w:rFonts w:ascii="Symbol" w:hAnsi="Symbol" w:hint="default"/>
+        <w:sz w:val="20"/>
+      </w:rPr>
+    </w:lvl>
+    <w:lvl w:ilvl="8" w:tentative="1">
+      <w:start w:val="1"/>
+      <w:numFmt w:val="bullet"/>
+      <w:lvlText w:val=""/>
+      <w:lvlJc w:val="left"/>
+      <w:pPr>
+        <w:tabs>
+          <w:tab w:val="num" w:pos="6480"/>
+        </w:tabs>
+        <w:ind w:left="6480" w:hanging="360"/>
+      </w:pPr>
+      <w:rPr>
+        <w:rFonts w:ascii="Symbol" w:hAnsi="Symbol" w:hint="default"/>
+        <w:sz w:val="20"/>
+      </w:rPr>
+    </w:lvl>
+  </w:abstractNum>
   <w:num w:numId="1" w16cid:durableId="772821007">
-    <w:abstractNumId w:val="7"/>
+    <w:abstractNumId w:val="8"/>
   </w:num>
   <w:num w:numId="2" w16cid:durableId="139467846">
     <w:abstractNumId w:val="6"/>
   </w:num>
   <w:num w:numId="3" w16cid:durableId="2074543910">
-    <w:abstractNumId w:val="9"/>
+    <w:abstractNumId w:val="10"/>
   </w:num>
   <w:num w:numId="4" w16cid:durableId="1020545699">
-    <w:abstractNumId w:val="10"/>
+    <w:abstractNumId w:val="11"/>
   </w:num>
   <w:num w:numId="5" w16cid:durableId="1788544290">
     <w:abstractNumId w:val="5"/>
   </w:num>
   <w:num w:numId="6" w16cid:durableId="626662361">
-    <w:abstractNumId w:val="11"/>
+    <w:abstractNumId w:val="12"/>
   </w:num>
   <w:num w:numId="7" w16cid:durableId="1974796331">
     <w:abstractNumId w:val="0"/>
@@ -3732,10 +3890,16 @@
     <w:abstractNumId w:val="1"/>
   </w:num>
   <w:num w:numId="12" w16cid:durableId="1074476898">
-    <w:abstractNumId w:val="8"/>
+    <w:abstractNumId w:val="9"/>
   </w:num>
   <w:num w:numId="13" w16cid:durableId="150411431">
-    <w:abstractNumId w:val="12"/>
+    <w:abstractNumId w:val="13"/>
+  </w:num>
+  <w:num w:numId="14" w16cid:durableId="1092162030">
+    <w:abstractNumId w:val="7"/>
+  </w:num>
+  <w:num w:numId="15" w16cid:durableId="656768883">
+    <w:abstractNumId w:val="14"/>
   </w:num>
   <w:numIdMacAtCleanup w:val="10"/>
 </w:numbering>
@@ -4141,6 +4305,10 @@
   <w:style w:type="paragraph" w:default="1" w:styleId="Normal">
     <w:name w:val="Normal"/>
     <w:qFormat/>
+    <w:rsid w:val="00720820"/>
+    <w:pPr>
+      <w:spacing w:line="276" w:lineRule="auto"/>
+    </w:pPr>
   </w:style>
   <w:style w:type="paragraph" w:styleId="Heading1">
     <w:name w:val="heading 1"/>
@@ -4153,7 +4321,7 @@
     <w:pPr>
       <w:keepNext/>
       <w:keepLines/>
-      <w:spacing w:before="360" w:after="80"/>
+      <w:spacing w:before="360" w:after="80" w:line="278" w:lineRule="auto"/>
       <w:outlineLvl w:val="0"/>
     </w:pPr>
     <w:rPr>
@@ -4176,7 +4344,7 @@
     <w:pPr>
       <w:keepNext/>
       <w:keepLines/>
-      <w:spacing w:before="160" w:after="80"/>
+      <w:spacing w:before="160" w:after="80" w:line="278" w:lineRule="auto"/>
       <w:outlineLvl w:val="1"/>
     </w:pPr>
     <w:rPr>
@@ -4199,7 +4367,7 @@
     <w:pPr>
       <w:keepNext/>
       <w:keepLines/>
-      <w:spacing w:before="160" w:after="80"/>
+      <w:spacing w:before="160" w:after="80" w:line="278" w:lineRule="auto"/>
       <w:outlineLvl w:val="2"/>
     </w:pPr>
     <w:rPr>
@@ -4222,7 +4390,7 @@
     <w:pPr>
       <w:keepNext/>
       <w:keepLines/>
-      <w:spacing w:before="80" w:after="40"/>
+      <w:spacing w:before="80" w:after="40" w:line="278" w:lineRule="auto"/>
       <w:outlineLvl w:val="3"/>
     </w:pPr>
     <w:rPr>
@@ -4245,7 +4413,7 @@
     <w:pPr>
       <w:keepNext/>
       <w:keepLines/>
-      <w:spacing w:before="80" w:after="40"/>
+      <w:spacing w:before="80" w:after="40" w:line="278" w:lineRule="auto"/>
       <w:outlineLvl w:val="4"/>
     </w:pPr>
     <w:rPr>
@@ -4266,7 +4434,7 @@
     <w:pPr>
       <w:keepNext/>
       <w:keepLines/>
-      <w:spacing w:before="40" w:after="0"/>
+      <w:spacing w:before="40" w:after="0" w:line="278" w:lineRule="auto"/>
       <w:outlineLvl w:val="5"/>
     </w:pPr>
     <w:rPr>
@@ -4289,7 +4457,7 @@
     <w:pPr>
       <w:keepNext/>
       <w:keepLines/>
-      <w:spacing w:before="40" w:after="0"/>
+      <w:spacing w:before="40" w:after="0" w:line="278" w:lineRule="auto"/>
       <w:outlineLvl w:val="6"/>
     </w:pPr>
     <w:rPr>
@@ -4310,7 +4478,7 @@
     <w:pPr>
       <w:keepNext/>
       <w:keepLines/>
-      <w:spacing w:after="0"/>
+      <w:spacing w:after="0" w:line="278" w:lineRule="auto"/>
       <w:outlineLvl w:val="7"/>
     </w:pPr>
     <w:rPr>
@@ -4333,7 +4501,7 @@
     <w:pPr>
       <w:keepNext/>
       <w:keepLines/>
-      <w:spacing w:after="0"/>
+      <w:spacing w:after="0" w:line="278" w:lineRule="auto"/>
       <w:outlineLvl w:val="8"/>
     </w:pPr>
     <w:rPr>
@@ -4533,6 +4701,7 @@
       <w:numPr>
         <w:ilvl w:val="1"/>
       </w:numPr>
+      <w:spacing w:line="278" w:lineRule="auto"/>
     </w:pPr>
     <w:rPr>
       <w:rFonts w:eastAsiaTheme="majorEastAsia" w:cstheme="majorBidi"/>
@@ -4565,7 +4734,7 @@
     <w:qFormat/>
     <w:rsid w:val="00D05CBE"/>
     <w:pPr>
-      <w:spacing w:before="160"/>
+      <w:spacing w:before="160" w:line="278" w:lineRule="auto"/>
       <w:jc w:val="center"/>
     </w:pPr>
     <w:rPr>
@@ -4593,6 +4762,7 @@
     <w:qFormat/>
     <w:rsid w:val="00D05CBE"/>
     <w:pPr>
+      <w:spacing w:line="278" w:lineRule="auto"/>
       <w:ind w:left="720"/>
       <w:contextualSpacing/>
     </w:pPr>
@@ -4622,7 +4792,7 @@
         <w:top w:val="single" w:sz="4" w:space="10" w:color="0F4761" w:themeColor="accent1" w:themeShade="BF"/>
         <w:bottom w:val="single" w:sz="4" w:space="10" w:color="0F4761" w:themeColor="accent1" w:themeShade="BF"/>
       </w:pBdr>
-      <w:spacing w:before="360" w:after="360"/>
+      <w:spacing w:before="360" w:after="360" w:line="278" w:lineRule="auto"/>
       <w:ind w:left="864" w:right="864"/>
       <w:jc w:val="center"/>
     </w:pPr>
@@ -4684,6 +4854,9 @@
     <w:semiHidden/>
     <w:unhideWhenUsed/>
     <w:rsid w:val="002972AC"/>
+    <w:pPr>
+      <w:spacing w:line="278" w:lineRule="auto"/>
+    </w:pPr>
     <w:rPr>
       <w:rFonts w:ascii="Times New Roman" w:hAnsi="Times New Roman" w:cs="Times New Roman"/>
     </w:rPr>

</xml_diff>